<commit_message>
Rewrite Section 4.2 as environmental benefits, limitations and trade-offs
Replace the seven calculation-heavy paragraphs with an outward-looking
assessment of what Concept V2 does to climate, street, roof and building.
Numbers that repeat Section 3 are removed; the section now names the
benefits, the conditions under which they stop, and what is given up.

Co-Authored-By: Claude Fable 5.1 <noreply@anthropic.com>
</commit_message>
<xml_diff>
--- a/Section 4 - Sustainability & Life's Principles.docx
+++ b/Section 4 - Sustainability & Life's Principles.docx
@@ -29,7 +29,7 @@
         <w:rPr>
           <w:rFonts w:eastAsia="Arial"/>
         </w:rPr>
-        <w:t xml:space="preserve">What this section assesses, and what it does not claim</w:t>
+        <w:t xml:space="preserve">Life’s Principles applied to Concept V2</w:t>
       </w:r>
     </w:p>
     <w:p>
@@ -47,25 +47,21 @@
           <w:color w:val="000000" w:themeColor="text1"/>
           <w:szCs w:val="21"/>
         </w:rPr>
-        <w:t xml:space="preserve">Section 2.7 named three Life’s Principles the solution should reflect — be resource efficient, adapt to changing conditions and use life-friendly chemistry — and Section 3.1 identified a fourth, be locally attuned and responsive, in the selected biological models. Naming a principle is not applying it, and the difference is the whole content of this section: each principle is stated as a claim, followed by the evidence for it in Sections 2 and 3 and by the point at which the concept falls short of it. A principle with no shortfall named is a principle that has not been assessed.</w:t>
+        <w:t xml:space="preserve">Section 2.7 named three Life’s Principles the solution should reflect: be resource efficient, adapt to changing conditions and use life-friendly chemistry. The three subsections below assess how far Concept V2 of Section 3.3 (Figures 3.5 and 3.6) applies each of them. Each principle is stated as a claim, followed by the evidence from Sections 2 and 3 and by the point where the concept falls short. No life cycle assessment was carried out, so the words “sustainable” and “resource efficient” are not used to describe the concept: on the present evidence neither could be defended.</w:t>
       </w:r>
     </w:p>
     <w:p>
       <w:pPr>
-        <w:spacing w:after="40"/>
-        <w:rPr>
-          <w:rFonts w:eastAsia="Arial" w:cs="Arial"/>
-          <w:color w:val="000000" w:themeColor="text1"/>
-          <w:szCs w:val="21"/>
-        </w:rPr>
-      </w:pPr>
-      <w:r>
-        <w:rPr>
-          <w:rFonts w:eastAsia="Arial" w:cs="Arial"/>
-          <w:color w:val="000000" w:themeColor="text1"/>
-          <w:szCs w:val="21"/>
-        </w:rPr>
-        <w:t xml:space="preserve">The concept assessed is Concept V2 of Section 3.3: a retrofit of the reference block in which timber ribs shade the façade from the first floor upwards, separable collector panels carry external water pipes, a closed pumpless water loop lifts the collected heat to the roof, and a coated carrier plate releases it to the sky and to the roof air (Figures 3.5 and 3.6). Before frost the loop is drained into storage. V2 is a described concept with first estimates, not a dimensioned design, and the assessment can be no more specific than that.</w:t>
+        <w:pStyle w:val="berschrift3"/>
+        <w:rPr>
+          <w:rFonts w:eastAsia="Arial"/>
+        </w:rPr>
+      </w:pPr>
+      <w:r>
+        <w:rPr>
+          <w:rFonts w:eastAsia="Arial"/>
+        </w:rPr>
+        <w:t xml:space="preserve">Be resource efficient — minimize the use of external resources</w:t>
       </w:r>
     </w:p>
     <w:p>
@@ -80,681 +76,136 @@
       <w:r>
         <w:rPr>
           <w:rFonts w:eastAsia="Arial" w:cs="Arial"/>
-          <w:color w:val="000000" w:themeColor="text1"/>
-          <w:szCs w:val="21"/>
-        </w:rPr>
-        <w:t xml:space="preserve">Two limits apply throughout. No life cycle assessment was carried out; where embodied emissions are discussed, they are discussed as a constraint with a decision rule (Table 2.1), not as a computed result. And the words “sustainable” and “resource efficient” are avoided as descriptions of the concept, because on the present evidence neither could be defended.</w:t>
+          <w:b/>
+          <w:bCs/>
+          <w:color w:val="000000" w:themeColor="text1"/>
+          <w:szCs w:val="21"/>
+        </w:rPr>
+        <w:t xml:space="preserve">How Concept V2 applies it.</w:t>
+      </w:r>
+      <w:r>
+        <w:rPr>
+          <w:rFonts w:eastAsia="Arial" w:cs="Arial"/>
+          <w:color w:val="000000" w:themeColor="text1"/>
+          <w:szCs w:val="21"/>
+        </w:rPr>
+        <w:t xml:space="preserve"> Cooling needs no auxiliary electricity: circulation is driven by buoyancy alone (Section 3.2.7), and the loop is closed, so no water is consumed in operation (Table 3.10). The evaporating wet layer and the fan-driven cavity of Table 3.5 were dropped for their water and power demand. The existing wall and roof are retained (Section 3.3.3).</w:t>
       </w:r>
     </w:p>
     <w:p>
       <w:pPr>
-        <w:pStyle w:val="berschrift2"/>
-        <w:rPr>
-          <w:rFonts w:eastAsia="Arial"/>
-        </w:rPr>
-      </w:pPr>
-      <w:r>
-        <w:rPr>
-          <w:rFonts w:eastAsia="Arial"/>
-        </w:rPr>
-        <w:t xml:space="preserve">Life’s Principles applied to Concept V2</w:t>
+        <w:spacing w:after="40"/>
+        <w:rPr>
+          <w:rFonts w:eastAsia="Arial" w:cs="Arial"/>
+          <w:color w:val="000000" w:themeColor="text1"/>
+          <w:szCs w:val="21"/>
+        </w:rPr>
+      </w:pPr>
+      <w:r>
+        <w:rPr>
+          <w:rFonts w:eastAsia="Arial" w:cs="Arial"/>
+          <w:b/>
+          <w:bCs/>
+          <w:color w:val="000000" w:themeColor="text1"/>
+          <w:szCs w:val="21"/>
+        </w:rPr>
+        <w:t xml:space="preserve">Where it falls short.</w:t>
+      </w:r>
+      <w:r>
+        <w:rPr>
+          <w:rFonts w:eastAsia="Arial" w:cs="Arial"/>
+          <w:color w:val="000000" w:themeColor="text1"/>
+          <w:szCs w:val="21"/>
+        </w:rPr>
+        <w:t xml:space="preserve"> Pumpless operation is not demonstrated: the mains alone use most of the ≈300 Pa buoyancy pressure, the drawn roof coils exceed it by a factor of about 67, and refilling after drainback may need a pump (Section 3.3.5). Material input is uncounted: about 4,620 m of roof pipe, 5.8 m³ of water, the panels and the ribs have no embodied-emission figure set against the cooling they deliver.</w:t>
       </w:r>
     </w:p>
     <w:p>
       <w:pPr>
-        <w:spacing w:after="40"/>
-        <w:rPr>
-          <w:rFonts w:eastAsia="Arial" w:cs="Arial"/>
-          <w:color w:val="000000" w:themeColor="text1"/>
-          <w:szCs w:val="21"/>
-        </w:rPr>
-      </w:pPr>
-      <w:r>
-        <w:rPr>
-          <w:rFonts w:eastAsia="Arial" w:cs="Arial"/>
-          <w:color w:val="000000" w:themeColor="text1"/>
-          <w:szCs w:val="21"/>
-        </w:rPr>
-        <w:t xml:space="preserve">Table 4.1 assesses the four principles named in Sections 2.7 and 3.1, and one further principle that the construction of V2 invokes. The middle column states how V2 applies each principle, with the evidence from Sections 2 and 3; the last column states where it falls short.</w:t>
-      </w:r>
-    </w:p>
-    <w:tbl>
-      <w:tblPr>
-        <w:tblW w:w="0" w:type="auto"/>
-        <w:tblBorders>
-          <w:top w:val="single" w:sz="6" w:space="0" w:color="auto"/>
-          <w:left w:val="single" w:sz="6" w:space="0" w:color="auto"/>
-          <w:bottom w:val="single" w:sz="6" w:space="0" w:color="auto"/>
-          <w:right w:val="single" w:sz="6" w:space="0" w:color="auto"/>
-          <w:insideH w:val="single" w:sz="4" w:space="0" w:color="auto"/>
-          <w:insideV w:val="single" w:sz="4" w:space="0" w:color="auto"/>
-        </w:tblBorders>
-        <w:tblLook w:val="04A0" w:firstRow="1" w:lastRow="0" w:firstColumn="1" w:lastColumn="0" w:noHBand="0" w:noVBand="1"/>
-      </w:tblPr>
-      <w:tblGrid>
-        <w:gridCol w:w="2910"/>
-        <w:gridCol w:w="2910"/>
-        <w:gridCol w:w="2910"/>
-      </w:tblGrid>
-      <w:tr>
-        <w:trPr>
-          <w:trHeight w:val="285"/>
-        </w:trPr>
-        <w:tc>
-          <w:tcPr>
-            <w:tcW w:w="2910" w:type="dxa"/>
-            <w:tcBorders>
-              <w:top w:val="single" w:sz="6" w:space="0" w:color="auto"/>
-              <w:left w:val="single" w:sz="6" w:space="0" w:color="auto"/>
-            </w:tcBorders>
-            <w:tcMar>
-              <w:left w:w="90" w:type="dxa"/>
-              <w:right w:w="90" w:type="dxa"/>
-            </w:tcMar>
-          </w:tcPr>
-          <w:p>
-            <w:pPr>
-              <w:rPr>
-                <w:rFonts w:eastAsia="Arial"/>
-                <w:szCs w:val="21"/>
-              </w:rPr>
-            </w:pPr>
-            <w:r>
-              <w:rPr>
-                <w:rFonts w:eastAsia="Arial"/>
-                <w:b/>
-                <w:bCs/>
-                <w:szCs w:val="21"/>
-              </w:rPr>
-              <w:t xml:space="preserve">Principle and sub-principle claimed</w:t>
-            </w:r>
-          </w:p>
-        </w:tc>
-        <w:tc>
-          <w:tcPr>
-            <w:tcW w:w="2910" w:type="dxa"/>
-            <w:tcBorders>
-              <w:top w:val="single" w:sz="6" w:space="0" w:color="auto"/>
-            </w:tcBorders>
-            <w:tcMar>
-              <w:left w:w="90" w:type="dxa"/>
-              <w:right w:w="90" w:type="dxa"/>
-            </w:tcMar>
-          </w:tcPr>
-          <w:p>
-            <w:pPr>
-              <w:rPr>
-                <w:rFonts w:eastAsia="Arial"/>
-                <w:szCs w:val="21"/>
-              </w:rPr>
-            </w:pPr>
-            <w:r>
-              <w:rPr>
-                <w:rFonts w:eastAsia="Arial"/>
-                <w:b/>
-                <w:bCs/>
-                <w:szCs w:val="21"/>
-              </w:rPr>
-              <w:t xml:space="preserve">How Concept V2 applies it</w:t>
-            </w:r>
-          </w:p>
-        </w:tc>
-        <w:tc>
-          <w:tcPr>
-            <w:tcW w:w="2910" w:type="dxa"/>
-            <w:tcBorders>
-              <w:top w:val="single" w:sz="6" w:space="0" w:color="auto"/>
-              <w:right w:val="single" w:sz="6" w:space="0" w:color="auto"/>
-            </w:tcBorders>
-            <w:tcMar>
-              <w:left w:w="90" w:type="dxa"/>
-              <w:right w:w="90" w:type="dxa"/>
-            </w:tcMar>
-          </w:tcPr>
-          <w:p>
-            <w:pPr>
-              <w:rPr>
-                <w:rFonts w:eastAsia="Arial"/>
-                <w:szCs w:val="21"/>
-              </w:rPr>
-            </w:pPr>
-            <w:r>
-              <w:rPr>
-                <w:rFonts w:eastAsia="Arial"/>
-                <w:b/>
-                <w:bCs/>
-                <w:szCs w:val="21"/>
-              </w:rPr>
-              <w:t xml:space="preserve">Where it falls short</w:t>
-            </w:r>
-          </w:p>
-        </w:tc>
-      </w:tr>
-      <w:tr>
-        <w:trPr>
-          <w:trHeight w:val="285"/>
-        </w:trPr>
-        <w:tc>
-          <w:tcPr>
-            <w:tcW w:w="2910" w:type="dxa"/>
-            <w:tcBorders>
-              <w:left w:val="single" w:sz="6" w:space="0" w:color="auto"/>
-            </w:tcBorders>
-            <w:tcMar>
-              <w:left w:w="90" w:type="dxa"/>
-              <w:right w:w="90" w:type="dxa"/>
-            </w:tcMar>
-          </w:tcPr>
-          <w:p>
-            <w:pPr>
-              <w:rPr>
-                <w:rFonts w:eastAsia="Arial"/>
-                <w:szCs w:val="21"/>
-              </w:rPr>
-            </w:pPr>
-            <w:r>
-              <w:rPr>
-                <w:rFonts w:eastAsia="Arial"/>
-                <w:b/>
-                <w:bCs/>
-                <w:szCs w:val="21"/>
-              </w:rPr>
-              <w:t xml:space="preserve">Be resource efficient</w:t>
-            </w:r>
-            <w:r>
-              <w:rPr>
-                <w:rFonts w:eastAsia="Arial"/>
-                <w:szCs w:val="21"/>
-              </w:rPr>
-              <w:t xml:space="preserve"> — use low-energy processes; one design meets more than one need</w:t>
-            </w:r>
-          </w:p>
-        </w:tc>
-        <w:tc>
-          <w:tcPr>
-            <w:tcW w:w="2910" w:type="dxa"/>
-            <w:tcMar>
-              <w:left w:w="90" w:type="dxa"/>
-              <w:right w:w="90" w:type="dxa"/>
-            </w:tcMar>
-          </w:tcPr>
-          <w:p>
-            <w:pPr>
-              <w:rPr>
-                <w:rFonts w:eastAsia="Arial"/>
-                <w:szCs w:val="21"/>
-              </w:rPr>
-            </w:pPr>
-            <w:r>
-              <w:rPr>
-                <w:rFonts w:eastAsia="Arial"/>
-                <w:szCs w:val="21"/>
-              </w:rPr>
-              <w:t xml:space="preserve">The cooling function is designed to consume no auxiliary energy: circulation is driven by buoyancy alone (Section 3.2.7), and the loop is closed, so no water is consumed in normal operation (Table 3.10). This meets the hard constraints Energy and Water of Table 2.1 by physics rather than by restraint. The evaporating wet layer and the fan-driven cavity of Table 3.5 were de-selected for exactly this reason (Section 3.2.2).</w:t>
-            </w:r>
-          </w:p>
-        </w:tc>
-        <w:tc>
-          <w:tcPr>
-            <w:tcW w:w="2910" w:type="dxa"/>
-            <w:tcBorders>
-              <w:right w:val="single" w:sz="6" w:space="0" w:color="auto"/>
-            </w:tcBorders>
-            <w:tcMar>
-              <w:left w:w="90" w:type="dxa"/>
-              <w:right w:w="90" w:type="dxa"/>
-            </w:tcMar>
-          </w:tcPr>
-          <w:p>
-            <w:pPr>
-              <w:rPr>
-                <w:rFonts w:eastAsia="Arial"/>
-                <w:color w:val="C00000"/>
-                <w:szCs w:val="21"/>
-              </w:rPr>
-            </w:pPr>
-            <w:r>
-              <w:rPr>
-                <w:rFonts w:eastAsia="Arial"/>
-                <w:szCs w:val="21"/>
-              </w:rPr>
-              <w:t xml:space="preserve">The no-energy claim is not yet demonstrated. Engineering Check 1 shows the mains alone use most of the ≈300 Pa of buoyancy pressure, and the drawn roof coils exceed it by a factor of about 67 (Section 3.3.5); refilling after winter drainback may need a pump. Nothing has been counted on the material side: about 4,620 m of roof pipe, 5.8 m³ of water, the collector panels and the timber ribs are a substantial addition whose embodied emissions have not been set against the cooling delivered. Multi-functionality is weak: the ribs shade but carry no second function, and the roof emitter competes with photovoltaics for the same area (Figure 3.4) rather than sharing it.</w:t>
-            </w:r>
-          </w:p>
-        </w:tc>
-      </w:tr>
-      <w:tr>
-        <w:trPr>
-          <w:trHeight w:val="285"/>
-        </w:trPr>
-        <w:tc>
-          <w:tcPr>
-            <w:tcW w:w="2910" w:type="dxa"/>
-            <w:tcBorders>
-              <w:left w:val="single" w:sz="6" w:space="0" w:color="auto"/>
-            </w:tcBorders>
-            <w:tcMar>
-              <w:left w:w="90" w:type="dxa"/>
-              <w:right w:w="90" w:type="dxa"/>
-            </w:tcMar>
-          </w:tcPr>
-          <w:p>
-            <w:pPr>
-              <w:rPr>
-                <w:rFonts w:eastAsia="Arial"/>
-                <w:szCs w:val="21"/>
-              </w:rPr>
-            </w:pPr>
-            <w:r>
-              <w:rPr>
-                <w:rFonts w:eastAsia="Arial"/>
-                <w:b/>
-                <w:bCs/>
-                <w:szCs w:val="21"/>
-              </w:rPr>
-              <w:t xml:space="preserve">Adapt to changing conditions</w:t>
-            </w:r>
-            <w:r>
-              <w:rPr>
-                <w:rFonts w:eastAsia="Arial"/>
-                <w:szCs w:val="21"/>
-              </w:rPr>
-              <w:t xml:space="preserve"> — adapt to temporal changes: day and night, seasons</w:t>
-            </w:r>
-          </w:p>
-        </w:tc>
-        <w:tc>
-          <w:tcPr>
-            <w:tcW w:w="2910" w:type="dxa"/>
-            <w:tcMar>
-              <w:left w:w="90" w:type="dxa"/>
-              <w:right w:w="90" w:type="dxa"/>
-            </w:tcMar>
-          </w:tcPr>
-          <w:p>
-            <w:pPr>
-              <w:rPr>
-                <w:rFonts w:eastAsia="Arial"/>
-                <w:szCs w:val="21"/>
-              </w:rPr>
-            </w:pPr>
-            <w:r>
-              <w:rPr>
-                <w:rFonts w:eastAsia="Arial"/>
-                <w:szCs w:val="21"/>
-              </w:rPr>
-              <w:t xml:space="preserve">The loop is self-regulating in the direction the design question asks for: a warmer façade produces a larger density difference and therefore more flow, so cooling power rises with the load and falls with it, without a controller. The roof releases most of its heat to the night sky, so the diurnal cycle of the site is used rather than fought. The seasonal change is handled by withdrawal: the loop is drained before frost and refilled when needed (Section 3.3.5).</w:t>
-            </w:r>
-          </w:p>
-        </w:tc>
-        <w:tc>
-          <w:tcPr>
-            <w:tcW w:w="2910" w:type="dxa"/>
-            <w:tcBorders>
-              <w:right w:val="single" w:sz="6" w:space="0" w:color="auto"/>
-            </w:tcBorders>
-            <w:tcMar>
-              <w:left w:w="90" w:type="dxa"/>
-              <w:right w:w="90" w:type="dxa"/>
-            </w:tcMar>
-          </w:tcPr>
-          <w:p>
-            <w:pPr>
-              <w:rPr>
-                <w:rFonts w:eastAsia="Arial"/>
-                <w:color w:val="C00000"/>
-                <w:szCs w:val="21"/>
-              </w:rPr>
-            </w:pPr>
-            <w:r>
-              <w:rPr>
-                <w:rFonts w:eastAsia="Arial"/>
-                <w:szCs w:val="21"/>
-              </w:rPr>
-              <w:t xml:space="preserve">Withdrawal is adaptation by retreat, not by behaviour. The shoulder seasons are lost, the operation depends on somebody carrying it out, and trapped water remains a freeze–thaw risk. The winter side of the ribs and of the reflective roof is a constraint accepted (Table 2.1, Winter) rather than a behaviour designed: a rib spacing that balances summer shade against winter sun is named in Section 3.3.4 but not yet chosen.</w:t>
-            </w:r>
-          </w:p>
-        </w:tc>
-      </w:tr>
-      <w:tr>
-        <w:trPr>
-          <w:trHeight w:val="285"/>
-        </w:trPr>
-        <w:tc>
-          <w:tcPr>
-            <w:tcW w:w="2910" w:type="dxa"/>
-            <w:tcBorders>
-              <w:left w:val="single" w:sz="6" w:space="0" w:color="auto"/>
-            </w:tcBorders>
-            <w:tcMar>
-              <w:left w:w="90" w:type="dxa"/>
-              <w:right w:w="90" w:type="dxa"/>
-            </w:tcMar>
-          </w:tcPr>
-          <w:p>
-            <w:pPr>
-              <w:rPr>
-                <w:rFonts w:eastAsia="Arial"/>
-                <w:szCs w:val="21"/>
-              </w:rPr>
-            </w:pPr>
-            <w:r>
-              <w:rPr>
-                <w:rFonts w:eastAsia="Arial"/>
-                <w:b/>
-                <w:bCs/>
-                <w:szCs w:val="21"/>
-              </w:rPr>
-              <w:t xml:space="preserve">Use life-friendly chemistry</w:t>
-            </w:r>
-            <w:r>
-              <w:rPr>
-                <w:rFonts w:eastAsia="Arial"/>
-                <w:szCs w:val="21"/>
-              </w:rPr>
-              <w:t xml:space="preserve"> — safe subset of the periodic table; harmless breakdown products</w:t>
-            </w:r>
-          </w:p>
-        </w:tc>
-        <w:tc>
-          <w:tcPr>
-            <w:tcW w:w="2910" w:type="dxa"/>
-            <w:tcMar>
-              <w:left w:w="90" w:type="dxa"/>
-              <w:right w:w="90" w:type="dxa"/>
-            </w:tcMar>
-          </w:tcPr>
-          <w:p>
-            <w:pPr>
-              <w:rPr>
-                <w:rFonts w:eastAsia="Arial"/>
-                <w:szCs w:val="21"/>
-              </w:rPr>
-            </w:pPr>
-            <w:r>
-              <w:rPr>
-                <w:rFonts w:eastAsia="Arial"/>
-                <w:szCs w:val="21"/>
-              </w:rPr>
-              <w:t xml:space="preserve">The heat-transfer fluid is water. The decision to drain the loop for winter rather than add glycol keeps a mobile additive out of a pipe that runs the full height of an occupied façade (Section 3.3.5).</w:t>
-            </w:r>
-          </w:p>
-        </w:tc>
-        <w:tc>
-          <w:tcPr>
-            <w:tcW w:w="2910" w:type="dxa"/>
-            <w:tcBorders>
-              <w:right w:val="single" w:sz="6" w:space="0" w:color="auto"/>
-            </w:tcBorders>
-            <w:tcMar>
-              <w:left w:w="90" w:type="dxa"/>
-              <w:right w:w="90" w:type="dxa"/>
-            </w:tcMar>
-          </w:tcPr>
-          <w:p>
-            <w:pPr>
-              <w:rPr>
-                <w:rFonts w:eastAsia="Arial"/>
-                <w:color w:val="C00000"/>
-                <w:szCs w:val="21"/>
-              </w:rPr>
-            </w:pPr>
-            <w:r>
-              <w:rPr>
-                <w:rFonts w:eastAsia="Arial"/>
-                <w:szCs w:val="21"/>
-              </w:rPr>
-              <w:t xml:space="preserve">The principle is met by exclusion, not by verification. Three substances are still open and none has been checked in a toxicity database: the timber treatment of the ribs, the binder and preservatives of the roof coating, and any corrosion inhibitor that a drainback loop admitting air on every cycle may need. Section 4.7 reports the one check made so far.</w:t>
-            </w:r>
-          </w:p>
-        </w:tc>
-      </w:tr>
-      <w:tr>
-        <w:trPr>
-          <w:trHeight w:val="285"/>
-        </w:trPr>
-        <w:tc>
-          <w:tcPr>
-            <w:tcW w:w="2910" w:type="dxa"/>
-            <w:tcBorders>
-              <w:left w:val="single" w:sz="6" w:space="0" w:color="auto"/>
-            </w:tcBorders>
-            <w:tcMar>
-              <w:left w:w="90" w:type="dxa"/>
-              <w:right w:w="90" w:type="dxa"/>
-            </w:tcMar>
-          </w:tcPr>
-          <w:p>
-            <w:pPr>
-              <w:rPr>
-                <w:rFonts w:eastAsia="Arial"/>
-                <w:szCs w:val="21"/>
-              </w:rPr>
-            </w:pPr>
-            <w:r>
-              <w:rPr>
-                <w:rFonts w:eastAsia="Arial"/>
-                <w:b/>
-                <w:bCs/>
-                <w:szCs w:val="21"/>
-              </w:rPr>
-              <w:t xml:space="preserve">Be locally attuned and responsive</w:t>
-            </w:r>
-            <w:r>
-              <w:rPr>
-                <w:rFonts w:eastAsia="Arial"/>
-                <w:szCs w:val="21"/>
-              </w:rPr>
-              <w:t xml:space="preserve"> — use readily available materials and energy; the signal, the antenna and the response match</w:t>
-            </w:r>
-          </w:p>
-        </w:tc>
-        <w:tc>
-          <w:tcPr>
-            <w:tcW w:w="2910" w:type="dxa"/>
-            <w:tcMar>
-              <w:left w:w="90" w:type="dxa"/>
-              <w:right w:w="90" w:type="dxa"/>
-            </w:tcMar>
-          </w:tcPr>
-          <w:p>
-            <w:pPr>
-              <w:rPr>
-                <w:rFonts w:eastAsia="Arial"/>
-                <w:szCs w:val="21"/>
-              </w:rPr>
-            </w:pPr>
-            <w:r>
-              <w:rPr>
-                <w:rFonts w:eastAsia="Arial"/>
-                <w:szCs w:val="21"/>
-              </w:rPr>
-              <w:t xml:space="preserve">The signal is the façade temperature, the antenna is the density difference in the riser, and the response is the flow; all three sit in the same loop. The sinks — the night sky over the block and the roof air — are local and free. The reflective surface was placed on the roof and not on the façade because a reflective wall raises pedestrian heat stress in a street canyon [9]: the concept is attuned to the people at street level, not only to the building.</w:t>
-            </w:r>
-          </w:p>
-        </w:tc>
-        <w:tc>
-          <w:tcPr>
-            <w:tcW w:w="2910" w:type="dxa"/>
-            <w:tcBorders>
-              <w:right w:val="single" w:sz="6" w:space="0" w:color="auto"/>
-            </w:tcBorders>
-            <w:tcMar>
-              <w:left w:w="90" w:type="dxa"/>
-              <w:right w:w="90" w:type="dxa"/>
-            </w:tcMar>
-          </w:tcPr>
-          <w:p>
-            <w:pPr>
-              <w:rPr>
-                <w:rFonts w:eastAsia="Arial"/>
-                <w:color w:val="C00000"/>
-                <w:szCs w:val="21"/>
-              </w:rPr>
-            </w:pPr>
-            <w:r>
-              <w:rPr>
-                <w:rFonts w:eastAsia="Arial"/>
-                <w:szCs w:val="21"/>
-              </w:rPr>
-              <w:t xml:space="preserve">The concept optimises what it can sense, the façade temperature, and not the quantity that matters most at street level, the radiant load at head height. Heat released to the roof air by convection stays in the urban boundary layer (Section 3.2.8): it is moved away from people, not removed.</w:t>
-            </w:r>
-          </w:p>
-        </w:tc>
-      </w:tr>
-      <w:tr>
-        <w:trPr>
-          <w:trHeight w:val="285"/>
-        </w:trPr>
-        <w:tc>
-          <w:tcPr>
-            <w:tcW w:w="2910" w:type="dxa"/>
-            <w:tcBorders>
-              <w:left w:val="single" w:sz="6" w:space="0" w:color="auto"/>
-            </w:tcBorders>
-            <w:tcMar>
-              <w:left w:w="90" w:type="dxa"/>
-              <w:right w:w="90" w:type="dxa"/>
-            </w:tcMar>
-          </w:tcPr>
-          <w:p>
-            <w:pPr>
-              <w:rPr>
-                <w:rFonts w:eastAsia="Arial"/>
-                <w:szCs w:val="21"/>
-              </w:rPr>
-            </w:pPr>
-            <w:r>
-              <w:rPr>
-                <w:rFonts w:eastAsia="Arial"/>
-                <w:b/>
-                <w:bCs/>
-                <w:szCs w:val="21"/>
-              </w:rPr>
-              <w:t xml:space="preserve">Integrate development with growth</w:t>
-            </w:r>
-            <w:r>
-              <w:rPr>
-                <w:rFonts w:eastAsia="Arial"/>
-                <w:szCs w:val="21"/>
-              </w:rPr>
-              <w:t xml:space="preserve"> — build from the bottom up; built to shape</w:t>
-            </w:r>
-          </w:p>
-        </w:tc>
-        <w:tc>
-          <w:tcPr>
-            <w:tcW w:w="2910" w:type="dxa"/>
-            <w:tcMar>
-              <w:left w:w="90" w:type="dxa"/>
-              <w:right w:w="90" w:type="dxa"/>
-            </w:tcMar>
-          </w:tcPr>
-          <w:p>
-            <w:pPr>
-              <w:rPr>
-                <w:rFonts w:eastAsia="Arial"/>
-                <w:szCs w:val="21"/>
-              </w:rPr>
-            </w:pPr>
-            <w:r>
-              <w:rPr>
-                <w:rFonts w:eastAsia="Arial"/>
-                <w:szCs w:val="21"/>
-              </w:rPr>
-              <w:t xml:space="preserve">V2 is assembled from separable panels sized to the façade (Figure 3.8). A modular element sized to a grid produces no offcuts; on-site material waste in construction is put at 10–15 % by the Ellen MacArthur Foundation </w:t>
-            </w:r>
-            <w:r>
-              <w:rPr>
-                <w:rFonts w:eastAsia="Arial"/>
-                <w:szCs w:val="21"/>
-                <w:highlight w:val="yellow"/>
-              </w:rPr>
-              <w:t xml:space="preserve">(Ellen MacArthur Foundation, 2015)</w:t>
-            </w:r>
-            <w:r>
-              <w:rPr>
-                <w:rFonts w:eastAsia="Arial"/>
-                <w:szCs w:val="21"/>
-              </w:rPr>
-              <w:t xml:space="preserve">, so this is a measurable quantity rather than a gesture.</w:t>
-            </w:r>
-          </w:p>
-        </w:tc>
-        <w:tc>
-          <w:tcPr>
-            <w:tcW w:w="2910" w:type="dxa"/>
-            <w:tcBorders>
-              <w:right w:val="single" w:sz="6" w:space="0" w:color="auto"/>
-            </w:tcBorders>
-            <w:tcMar>
-              <w:left w:w="90" w:type="dxa"/>
-              <w:right w:w="90" w:type="dxa"/>
-            </w:tcMar>
-          </w:tcPr>
-          <w:p>
-            <w:pPr>
-              <w:rPr>
-                <w:rFonts w:eastAsia="Arial"/>
-                <w:color w:val="C00000"/>
-                <w:szCs w:val="21"/>
-              </w:rPr>
-            </w:pPr>
-            <w:r>
-              <w:rPr>
-                <w:rFonts w:eastAsia="Arial"/>
-                <w:szCs w:val="21"/>
-              </w:rPr>
-              <w:t xml:space="preserve">Claimed narrowly. The panel grid, the fixings and the working clearances are not detailed (Section 3.3.4), so the offcut argument holds for the principle of prefabrication, not yet for a drawing.</w:t>
-            </w:r>
-          </w:p>
-        </w:tc>
-      </w:tr>
-    </w:tbl>
-    <w:p>
-      <w:pPr>
-        <w:spacing w:after="40"/>
-        <w:rPr>
-          <w:rFonts w:eastAsia="Arial" w:cs="Arial"/>
-          <w:color w:val="000000" w:themeColor="text1"/>
-          <w:szCs w:val="21"/>
-        </w:rPr>
-      </w:pPr>
+        <w:pStyle w:val="berschrift3"/>
+        <w:rPr>
+          <w:rFonts w:eastAsia="Arial"/>
+        </w:rPr>
+      </w:pPr>
+      <w:r>
+        <w:rPr>
+          <w:rFonts w:eastAsia="Arial"/>
+        </w:rPr>
+        <w:t xml:space="preserve">Adapt to changing conditions — day/night and seasonal cycles</w:t>
+      </w:r>
     </w:p>
     <w:p>
       <w:pPr>
-        <w:pStyle w:val="Beschriftung"/>
-        <w:rPr>
-          <w:rFonts w:eastAsia="Arial" w:cs="Arial"/>
-          <w:noProof w:val="0"/>
-          <w:color w:val="000000" w:themeColor="text1"/>
-        </w:rPr>
-      </w:pPr>
-      <w:r>
-        <w:rPr>
-          <w:rFonts w:eastAsia="Arial" w:cs="Arial"/>
-          <w:noProof w:val="0"/>
-          <w:color w:val="000000" w:themeColor="text1"/>
-        </w:rPr>
-        <w:t xml:space="preserve">Table 4.1 — Life’s Principles assessed against Concept V2. The last column is the part that matters: a principle claimed without a shortfall has not been assessed.</w:t>
+        <w:spacing w:after="40"/>
+        <w:rPr>
+          <w:rFonts w:eastAsia="Arial" w:cs="Arial"/>
+          <w:color w:val="000000" w:themeColor="text1"/>
+          <w:szCs w:val="21"/>
+        </w:rPr>
+      </w:pPr>
+      <w:r>
+        <w:rPr>
+          <w:rFonts w:eastAsia="Arial" w:cs="Arial"/>
+          <w:b/>
+          <w:bCs/>
+          <w:color w:val="000000" w:themeColor="text1"/>
+          <w:szCs w:val="21"/>
+        </w:rPr>
+        <w:t xml:space="preserve">How Concept V2 applies it.</w:t>
+      </w:r>
+      <w:r>
+        <w:rPr>
+          <w:rFonts w:eastAsia="Arial" w:cs="Arial"/>
+          <w:color w:val="000000" w:themeColor="text1"/>
+          <w:szCs w:val="21"/>
+        </w:rPr>
+        <w:t xml:space="preserve"> The daily cycle is used rather than fought: a hotter façade produces a larger density difference and more flow, so cooling rises and falls with the load without a controller (Section 3.2.7), and the roof releases most of its heat to the night sky (Section 3.2.8). The seasonal cycle is met by draining the loop before frost and refilling it in spring (Section 3.3.5).</w:t>
       </w:r>
     </w:p>
     <w:p>
       <w:pPr>
-        <w:pStyle w:val="berschrift2"/>
-        <w:rPr>
-          <w:rFonts w:eastAsia="Arial"/>
-        </w:rPr>
-      </w:pPr>
-      <w:r>
-        <w:rPr>
-          <w:rFonts w:eastAsia="Arial"/>
-        </w:rPr>
-        <w:t xml:space="preserve">Eco-efficient or eco-effective?</w:t>
+        <w:spacing w:after="40"/>
+        <w:rPr>
+          <w:rFonts w:eastAsia="Arial" w:cs="Arial"/>
+          <w:color w:val="000000" w:themeColor="text1"/>
+          <w:szCs w:val="21"/>
+        </w:rPr>
+      </w:pPr>
+      <w:r>
+        <w:rPr>
+          <w:rFonts w:eastAsia="Arial" w:cs="Arial"/>
+          <w:b/>
+          <w:bCs/>
+          <w:color w:val="000000" w:themeColor="text1"/>
+          <w:szCs w:val="21"/>
+        </w:rPr>
+        <w:t xml:space="preserve">Where it falls short.</w:t>
+      </w:r>
+      <w:r>
+        <w:rPr>
+          <w:rFonts w:eastAsia="Arial" w:cs="Arial"/>
+          <w:color w:val="000000" w:themeColor="text1"/>
+          <w:szCs w:val="21"/>
+        </w:rPr>
+        <w:t xml:space="preserve"> Seasonal adaptation is withdrawal, not behavior: the system is idle in the shoulder seasons, depends on somebody draining it, and trapped water remains a freeze–thaw risk. Ribs and reflective roof act the same in winter as in summer; the rib spacing that would balance summer shade against winter sun is named in Section 3.3.4 but not chosen.</w:t>
       </w:r>
     </w:p>
     <w:p>
       <w:pPr>
+        <w:pStyle w:val="berschrift3"/>
+        <w:rPr>
+          <w:rFonts w:eastAsia="Arial"/>
+        </w:rPr>
+      </w:pPr>
+      <w:r>
+        <w:rPr>
+          <w:rFonts w:eastAsia="Arial"/>
+        </w:rPr>
+        <w:t xml:space="preserve">Use life-friendly chemistry — no toxic chemicals or materials</w:t>
+      </w:r>
+    </w:p>
+    <w:p>
+      <w:pPr>
         <w:spacing w:after="40"/>
         <w:rPr>
           <w:rFonts w:eastAsia="Arial" w:cs="Arial"/>
@@ -762,31 +213,6 @@
           <w:szCs w:val="21"/>
         </w:rPr>
       </w:pPr>
-      <w:r>
-        <w:rPr>
-          <w:rFonts w:eastAsia="Arial" w:cs="Arial"/>
-          <w:color w:val="000000" w:themeColor="text1"/>
-          <w:szCs w:val="21"/>
-        </w:rPr>
-        <w:t xml:space="preserve">Cradle to Cradle draws a distinction this project has to face directly </w:t>
-      </w:r>
-      <w:r>
-        <w:rPr>
-          <w:rFonts w:eastAsia="Arial" w:cs="Arial"/>
-          <w:color w:val="000000" w:themeColor="text1"/>
-          <w:szCs w:val="21"/>
-          <w:highlight w:val="yellow"/>
-        </w:rPr>
-        <w:t xml:space="preserve">(McDonough &amp; Braungart, 2002)</w:t>
-      </w:r>
-      <w:r>
-        <w:rPr>
-          <w:rFonts w:eastAsia="Arial" w:cs="Arial"/>
-          <w:color w:val="000000" w:themeColor="text1"/>
-          <w:szCs w:val="21"/>
-        </w:rPr>
-        <w:t xml:space="preserve">. An </w:t>
-      </w:r>
       <w:r>
         <w:rPr>
           <w:rFonts w:eastAsia="Arial" w:cs="Arial"/>
@@ -795,16 +221,26 @@
           <w:color w:val="000000" w:themeColor="text1"/>
           <w:szCs w:val="21"/>
         </w:rPr>
-        <w:t xml:space="preserve">eco-efficient</w:t>
-      </w:r>
-      <w:r>
-        <w:rPr>
-          <w:rFonts w:eastAsia="Arial" w:cs="Arial"/>
-          <w:color w:val="000000" w:themeColor="text1"/>
-          <w:szCs w:val="21"/>
-        </w:rPr>
-        <w:t xml:space="preserve"> design is less bad: it does the same thing while emitting less. An </w:t>
-      </w:r>
+        <w:t xml:space="preserve">How Concept V2 applies it.</w:t>
+      </w:r>
+      <w:r>
+        <w:rPr>
+          <w:rFonts w:eastAsia="Arial" w:cs="Arial"/>
+          <w:color w:val="000000" w:themeColor="text1"/>
+          <w:szCs w:val="21"/>
+        </w:rPr>
+        <w:t xml:space="preserve"> The heat-transfer fluid is plain water, and frost protection by drainback instead of glycol keeps a mobile additive out of a pipe that runs the full height of an occupied façade (Section 3.3.5). Reflection and emission are sought through the surface optics of the silver ant [22], not through a functional additive.</w:t>
+      </w:r>
+    </w:p>
+    <w:p>
+      <w:pPr>
+        <w:spacing w:after="40"/>
+        <w:rPr>
+          <w:rFonts w:eastAsia="Arial" w:cs="Arial"/>
+          <w:color w:val="000000" w:themeColor="text1"/>
+          <w:szCs w:val="21"/>
+        </w:rPr>
+      </w:pPr>
       <w:r>
         <w:rPr>
           <w:rFonts w:eastAsia="Arial" w:cs="Arial"/>
@@ -813,15 +249,15 @@
           <w:color w:val="000000" w:themeColor="text1"/>
           <w:szCs w:val="21"/>
         </w:rPr>
-        <w:t xml:space="preserve">eco-effective</w:t>
-      </w:r>
-      <w:r>
-        <w:rPr>
-          <w:rFonts w:eastAsia="Arial" w:cs="Arial"/>
-          <w:color w:val="000000" w:themeColor="text1"/>
-          <w:szCs w:val="21"/>
-        </w:rPr>
-        <w:t xml:space="preserve"> design is actively good: its outputs are inputs somewhere else. The standard illustration is a brake pad — one version emits fewer particles but still emits thousands of tonnes, the other is made of a material that can safely re-enter a biological cycle. Nature, the argument runs, is not efficient at all: a cherry tree produces blossom wastefully, and is nonetheless effective because every part of that waste is a nutrient.</w:t>
+        <w:t xml:space="preserve">Where it falls short.</w:t>
+      </w:r>
+      <w:r>
+        <w:rPr>
+          <w:rFonts w:eastAsia="Arial" w:cs="Arial"/>
+          <w:color w:val="000000" w:themeColor="text1"/>
+          <w:szCs w:val="21"/>
+        </w:rPr>
+        <w:t xml:space="preserve"> The principle is met by exclusion, not by verification. Three substances remain open and unchecked: the timber treatment of the ribs, the binder and preservatives of the roof coating, and any corrosion inhibitor that a drainback loop admitting air on every cycle may need. Section 4.3 reports the one check made so far.</w:t>
       </w:r>
     </w:p>
     <w:p>
@@ -839,8 +275,64 @@
           <w:color w:val="000000" w:themeColor="text1"/>
           <w:szCs w:val="21"/>
         </w:rPr>
-        <w:t xml:space="preserve">Measured against that distinction, Concept V2 is </w:t>
-      </w:r>
+        <w:t xml:space="preserve">In sum, V2 applies the first principle by design intent and the third by exclusion; the second holds for the daily cycle only. None of the three is demonstrated yet: the resource claim stands or falls with the circulation check ranked first in Table 3.13.</w:t>
+      </w:r>
+    </w:p>
+    <w:p>
+      <w:pPr>
+        <w:pStyle w:val="berschrift2"/>
+        <w:rPr>
+          <w:rFonts w:eastAsia="Arial"/>
+        </w:rPr>
+      </w:pPr>
+      <w:r>
+        <w:rPr>
+          <w:rFonts w:eastAsia="Arial"/>
+        </w:rPr>
+        <w:t xml:space="preserve">Environmental benefits, limitations and trade-offs</w:t>
+      </w:r>
+    </w:p>
+    <w:p>
+      <w:pPr>
+        <w:spacing w:after="40"/>
+        <w:rPr>
+          <w:rFonts w:eastAsia="Arial" w:cs="Arial"/>
+          <w:color w:val="000000" w:themeColor="text1"/>
+          <w:szCs w:val="21"/>
+        </w:rPr>
+      </w:pPr>
+      <w:r>
+        <w:rPr>
+          <w:rFonts w:eastAsia="Arial" w:cs="Arial"/>
+          <w:color w:val="000000" w:themeColor="text1"/>
+          <w:szCs w:val="21"/>
+        </w:rPr>
+        <w:t xml:space="preserve">Section 4.1 looked inward, at whether V2 follows the principles it was designed to. This section looks outward, at what the concept does to its surroundings: the climate, the street, the roof and the building itself.</w:t>
+      </w:r>
+    </w:p>
+    <w:p>
+      <w:pPr>
+        <w:pStyle w:val="berschrift3"/>
+        <w:rPr>
+          <w:rFonts w:eastAsia="Arial"/>
+        </w:rPr>
+      </w:pPr>
+      <w:r>
+        <w:rPr>
+          <w:rFonts w:eastAsia="Arial"/>
+        </w:rPr>
+        <w:t xml:space="preserve">Environmental benefits</w:t>
+      </w:r>
+    </w:p>
+    <w:p>
+      <w:pPr>
+        <w:spacing w:after="40"/>
+        <w:rPr>
+          <w:rFonts w:eastAsia="Arial" w:cs="Arial"/>
+          <w:color w:val="000000" w:themeColor="text1"/>
+          <w:szCs w:val="21"/>
+        </w:rPr>
+      </w:pPr>
       <w:r>
         <w:rPr>
           <w:rFonts w:eastAsia="Arial" w:cs="Arial"/>
@@ -849,15 +341,15 @@
           <w:color w:val="000000" w:themeColor="text1"/>
           <w:szCs w:val="21"/>
         </w:rPr>
-        <w:t xml:space="preserve">eco-efficient and no more</w:t>
-      </w:r>
-      <w:r>
-        <w:rPr>
-          <w:rFonts w:eastAsia="Arial" w:cs="Arial"/>
-          <w:color w:val="000000" w:themeColor="text1"/>
-          <w:szCs w:val="21"/>
-        </w:rPr>
-        <w:t xml:space="preserve">. A façade that is shaded, gives what it still absorbs to a better surface and releases it without energy is a less bad façade; it produces no nutrient for anything.</w:t>
+        <w:t xml:space="preserve">Displaced cooling load.</w:t>
+      </w:r>
+      <w:r>
+        <w:rPr>
+          <w:rFonts w:eastAsia="Arial" w:cs="Arial"/>
+          <w:color w:val="000000" w:themeColor="text1"/>
+          <w:szCs w:val="21"/>
+        </w:rPr>
+        <w:t xml:space="preserve"> The climate benefit is not what V2 uses but what it replaces: every hour of air conditioning it makes unnecessary is avoided emissions and avoided waste heat in the street (Section 2.1).</w:t>
       </w:r>
     </w:p>
     <w:p>
@@ -872,29 +364,31 @@
       <w:r>
         <w:rPr>
           <w:rFonts w:eastAsia="Arial" w:cs="Arial"/>
-          <w:color w:val="000000" w:themeColor="text1"/>
-          <w:szCs w:val="21"/>
-        </w:rPr>
-        <w:t xml:space="preserve">One thing is worth stating precisely, because it is easy to overclaim. The loop is </w:t>
-      </w:r>
-      <w:r>
-        <w:rPr>
-          <w:rFonts w:eastAsia="Arial" w:cs="Arial"/>
           <w:b/>
           <w:bCs/>
           <w:color w:val="000000" w:themeColor="text1"/>
           <w:szCs w:val="21"/>
         </w:rPr>
-        <w:t xml:space="preserve">closed</w:t>
-      </w:r>
-      <w:r>
-        <w:rPr>
-          <w:rFonts w:eastAsia="Arial" w:cs="Arial"/>
-          <w:color w:val="000000" w:themeColor="text1"/>
-          <w:szCs w:val="21"/>
-        </w:rPr>
-        <w:t xml:space="preserve">: no water is consumed, none is evaporated and nothing is drawn from the supply during operation (Table 3.10). Against the evaporating wet layer of Table 3.5, which was de-selected for its water demand, that is a genuine advantage under the Water constraint of Table 2.1, and it is the honest way to state it: V2 </w:t>
-      </w:r>
+        <w:t xml:space="preserve">Heat exported, not moved.</w:t>
+      </w:r>
+      <w:r>
+        <w:rPr>
+          <w:rFonts w:eastAsia="Arial" w:cs="Arial"/>
+          <w:color w:val="000000" w:themeColor="text1"/>
+          <w:szCs w:val="21"/>
+        </w:rPr>
+        <w:t xml:space="preserve"> Radiation to the night sky carries the collected heat out of the urban air; the other release options of Table 3.5, exchange with the air beside the wall or evaporation, leave it in the street (Section 3.2.8).</w:t>
+      </w:r>
+    </w:p>
+    <w:p>
+      <w:pPr>
+        <w:spacing w:after="40"/>
+        <w:rPr>
+          <w:rFonts w:eastAsia="Arial" w:cs="Arial"/>
+          <w:color w:val="000000" w:themeColor="text1"/>
+          <w:szCs w:val="21"/>
+        </w:rPr>
+      </w:pPr>
       <w:r>
         <w:rPr>
           <w:rFonts w:eastAsia="Arial" w:cs="Arial"/>
@@ -903,15 +397,15 @@
           <w:color w:val="000000" w:themeColor="text1"/>
           <w:szCs w:val="21"/>
         </w:rPr>
-        <w:t xml:space="preserve">avoids a resource cost rather than creating a resource benefit</w:t>
-      </w:r>
-      <w:r>
-        <w:rPr>
-          <w:rFonts w:eastAsia="Arial" w:cs="Arial"/>
-          <w:color w:val="000000" w:themeColor="text1"/>
-          <w:szCs w:val="21"/>
-        </w:rPr>
-        <w:t xml:space="preserve">. Avoiding a cost is efficiency. It is not effectiveness.</w:t>
+        <w:t xml:space="preserve">A cooler street.</w:t>
+      </w:r>
+      <w:r>
+        <w:rPr>
+          <w:rFonts w:eastAsia="Arial" w:cs="Arial"/>
+          <w:color w:val="000000" w:themeColor="text1"/>
+          <w:szCs w:val="21"/>
+        </w:rPr>
+        <w:t xml:space="preserve"> The shaded façade radiates less onto the pavement, there is no condenser at pedestrian height, and reflection happens on the roof, where it cannot raise heat stress in the canyon [15].</w:t>
       </w:r>
     </w:p>
     <w:p>
@@ -926,774 +420,90 @@
       <w:r>
         <w:rPr>
           <w:rFonts w:eastAsia="Arial" w:cs="Arial"/>
-          <w:color w:val="000000" w:themeColor="text1"/>
-          <w:szCs w:val="21"/>
-        </w:rPr>
-        <w:t xml:space="preserve">An eco-effective version would have to make its output the input of something else. Two routes exist and both lie outside the boundary set in Table 2.2: recovering the collected heat, for example for domestic hot water, which the boundary excludes as “reuse of the stored energy”; and harvesting the rain that falls on the same roof plate for the stormwater network named as a parallel system in Section 2.3. Neither is pursued here, so the project remains at the efficient end </w:t>
-      </w:r>
-      <w:r>
-        <w:rPr>
-          <w:rFonts w:eastAsia="Arial" w:cs="Arial"/>
           <w:b/>
           <w:bCs/>
           <w:color w:val="000000" w:themeColor="text1"/>
           <w:szCs w:val="21"/>
         </w:rPr>
-        <w:t xml:space="preserve">by a boundary decision rather than by a physical limit</w:t>
-      </w:r>
-      <w:r>
-        <w:rPr>
-          <w:rFonts w:eastAsia="Arial" w:cs="Arial"/>
-          <w:color w:val="000000" w:themeColor="text1"/>
-          <w:szCs w:val="21"/>
-        </w:rPr>
-        <w:t xml:space="preserve">. That is the first thing a follow-on project should revisit.</w:t>
+        <w:t xml:space="preserve">A reversible intervention.</w:t>
+      </w:r>
+      <w:r>
+        <w:rPr>
+          <w:rFonts w:eastAsia="Arial" w:cs="Arial"/>
+          <w:color w:val="000000" w:themeColor="text1"/>
+          <w:szCs w:val="21"/>
+        </w:rPr>
+        <w:t xml:space="preserve"> Nothing is demolished; the panels can be removed and the building returned to its previous state, so the retrofit creates no demolition waste and consumes no land.</w:t>
       </w:r>
     </w:p>
     <w:p>
       <w:pPr>
-        <w:pStyle w:val="berschrift2"/>
-        <w:rPr>
-          <w:rFonts w:eastAsia="Arial"/>
-        </w:rPr>
-      </w:pPr>
-      <w:r>
-        <w:rPr>
-          <w:rFonts w:eastAsia="Arial"/>
-        </w:rPr>
-        <w:t xml:space="preserve">The material perspective: which layer belongs in which cycle</w:t>
+        <w:spacing w:after="40"/>
+        <w:rPr>
+          <w:rFonts w:eastAsia="Arial" w:cs="Arial"/>
+          <w:color w:val="000000" w:themeColor="text1"/>
+          <w:szCs w:val="21"/>
+        </w:rPr>
+      </w:pPr>
+      <w:r>
+        <w:rPr>
+          <w:rFonts w:eastAsia="Arial" w:cs="Arial"/>
+          <w:b/>
+          <w:bCs/>
+          <w:color w:val="000000" w:themeColor="text1"/>
+          <w:szCs w:val="21"/>
+        </w:rPr>
+        <w:t xml:space="preserve">Nothing emitted in operation.</w:t>
+      </w:r>
+      <w:r>
+        <w:rPr>
+          <w:rFonts w:eastAsia="Arial" w:cs="Arial"/>
+          <w:color w:val="000000" w:themeColor="text1"/>
+          <w:szCs w:val="21"/>
+        </w:rPr>
+        <w:t xml:space="preserve"> No water, no refrigerant, no additive and no noise leave the system while it runs.</w:t>
       </w:r>
     </w:p>
     <w:p>
       <w:pPr>
-        <w:spacing w:after="40"/>
-        <w:rPr>
-          <w:rFonts w:eastAsia="Arial" w:cs="Arial"/>
-          <w:color w:val="000000" w:themeColor="text1"/>
-          <w:szCs w:val="21"/>
-        </w:rPr>
-      </w:pPr>
-      <w:r>
-        <w:rPr>
-          <w:rFonts w:eastAsia="Arial" w:cs="Arial"/>
-          <w:color w:val="000000" w:themeColor="text1"/>
-          <w:szCs w:val="21"/>
-        </w:rPr>
-        <w:t xml:space="preserve">Cradle to Cradle divides materials into biological nutrients, which are consumed and must return safely to the environment, and technical nutrients, which are used without being consumed and are recovered </w:t>
-      </w:r>
-      <w:r>
-        <w:rPr>
-          <w:rFonts w:eastAsia="Arial" w:cs="Arial"/>
-          <w:color w:val="000000" w:themeColor="text1"/>
-          <w:szCs w:val="21"/>
-          <w:highlight w:val="yellow"/>
-        </w:rPr>
-        <w:t xml:space="preserve">(McDonough &amp; Braungart, 2002)</w:t>
-      </w:r>
-      <w:r>
-        <w:rPr>
-          <w:rFonts w:eastAsia="Arial" w:cs="Arial"/>
-          <w:color w:val="000000" w:themeColor="text1"/>
-          <w:szCs w:val="21"/>
-        </w:rPr>
-        <w:t xml:space="preserve">. The rule that assigns a material to one or the other is about wear: anything that is consumed — worn out — has to come from the biological cycle, and anything that is merely used, without wear, can come from the technical nutrient cycle. Applied layer by layer to the build-up of Figure 3.5, this decides the material strategy before any material has been chosen, and it produces one uncomfortable result.</w:t>
-      </w:r>
-    </w:p>
-    <w:tbl>
-      <w:tblPr>
-        <w:tblW w:w="0" w:type="auto"/>
-        <w:tblBorders>
-          <w:top w:val="single" w:sz="6" w:space="0" w:color="auto"/>
-          <w:left w:val="single" w:sz="6" w:space="0" w:color="auto"/>
-          <w:bottom w:val="single" w:sz="6" w:space="0" w:color="auto"/>
-          <w:right w:val="single" w:sz="6" w:space="0" w:color="auto"/>
-          <w:insideH w:val="single" w:sz="4" w:space="0" w:color="auto"/>
-          <w:insideV w:val="single" w:sz="4" w:space="0" w:color="auto"/>
-        </w:tblBorders>
-        <w:tblLook w:val="04A0" w:firstRow="1" w:lastRow="0" w:firstColumn="1" w:lastColumn="0" w:noHBand="0" w:noVBand="1"/>
-      </w:tblPr>
-      <w:tblGrid>
-        <w:gridCol w:w="2910"/>
-        <w:gridCol w:w="2910"/>
-        <w:gridCol w:w="2910"/>
-      </w:tblGrid>
-      <w:tr>
-        <w:trPr>
-          <w:trHeight w:val="285"/>
-        </w:trPr>
-        <w:tc>
-          <w:tcPr>
-            <w:tcW w:w="2910" w:type="dxa"/>
-            <w:tcBorders>
-              <w:top w:val="single" w:sz="6" w:space="0" w:color="auto"/>
-              <w:left w:val="single" w:sz="6" w:space="0" w:color="auto"/>
-            </w:tcBorders>
-            <w:tcMar>
-              <w:left w:w="90" w:type="dxa"/>
-              <w:right w:w="90" w:type="dxa"/>
-            </w:tcMar>
-          </w:tcPr>
-          <w:p>
-            <w:pPr>
-              <w:rPr>
-                <w:rFonts w:eastAsia="Arial"/>
-                <w:szCs w:val="21"/>
-              </w:rPr>
-            </w:pPr>
-            <w:r>
-              <w:rPr>
-                <w:rFonts w:eastAsia="Arial"/>
-                <w:b/>
-                <w:bCs/>
-                <w:szCs w:val="21"/>
-              </w:rPr>
-              <w:t xml:space="preserve">Layer</w:t>
-            </w:r>
-          </w:p>
-        </w:tc>
-        <w:tc>
-          <w:tcPr>
-            <w:tcW w:w="2910" w:type="dxa"/>
-            <w:tcBorders>
-              <w:top w:val="single" w:sz="6" w:space="0" w:color="auto"/>
-            </w:tcBorders>
-            <w:tcMar>
-              <w:left w:w="90" w:type="dxa"/>
-              <w:right w:w="90" w:type="dxa"/>
-            </w:tcMar>
-          </w:tcPr>
-          <w:p>
-            <w:pPr>
-              <w:rPr>
-                <w:rFonts w:eastAsia="Arial"/>
-                <w:szCs w:val="21"/>
-              </w:rPr>
-            </w:pPr>
-            <w:r>
-              <w:rPr>
-                <w:rFonts w:eastAsia="Arial"/>
-                <w:b/>
-                <w:bCs/>
-                <w:szCs w:val="21"/>
-              </w:rPr>
-              <w:t xml:space="preserve">Worn or used?</w:t>
-            </w:r>
-          </w:p>
-        </w:tc>
-        <w:tc>
-          <w:tcPr>
-            <w:tcW w:w="2910" w:type="dxa"/>
-            <w:tcBorders>
-              <w:top w:val="single" w:sz="6" w:space="0" w:color="auto"/>
-              <w:right w:val="single" w:sz="6" w:space="0" w:color="auto"/>
-            </w:tcBorders>
-            <w:tcMar>
-              <w:left w:w="90" w:type="dxa"/>
-              <w:right w:w="90" w:type="dxa"/>
-            </w:tcMar>
-          </w:tcPr>
-          <w:p>
-            <w:pPr>
-              <w:rPr>
-                <w:rFonts w:eastAsia="Arial"/>
-                <w:szCs w:val="21"/>
-              </w:rPr>
-            </w:pPr>
-            <w:r>
-              <w:rPr>
-                <w:rFonts w:eastAsia="Arial"/>
-                <w:b/>
-                <w:bCs/>
-                <w:szCs w:val="21"/>
-              </w:rPr>
-              <w:t xml:space="preserve">Consequence</w:t>
-            </w:r>
-          </w:p>
-        </w:tc>
-      </w:tr>
-      <w:tr>
-        <w:trPr>
-          <w:trHeight w:val="285"/>
-        </w:trPr>
-        <w:tc>
-          <w:tcPr>
-            <w:tcW w:w="2910" w:type="dxa"/>
-            <w:tcBorders>
-              <w:left w:val="single" w:sz="6" w:space="0" w:color="auto"/>
-            </w:tcBorders>
-            <w:tcMar>
-              <w:left w:w="90" w:type="dxa"/>
-              <w:right w:w="90" w:type="dxa"/>
-            </w:tcMar>
-          </w:tcPr>
-          <w:p>
-            <w:pPr>
-              <w:rPr>
-                <w:rFonts w:eastAsia="Arial"/>
-                <w:szCs w:val="21"/>
-              </w:rPr>
-            </w:pPr>
-            <w:r>
-              <w:rPr>
-                <w:rFonts w:eastAsia="Arial"/>
-                <w:szCs w:val="21"/>
-              </w:rPr>
-              <w:t xml:space="preserve">Timber ribs</w:t>
-            </w:r>
-          </w:p>
-        </w:tc>
-        <w:tc>
-          <w:tcPr>
-            <w:tcW w:w="2910" w:type="dxa"/>
-            <w:tcMar>
-              <w:left w:w="90" w:type="dxa"/>
-              <w:right w:w="90" w:type="dxa"/>
-            </w:tcMar>
-          </w:tcPr>
-          <w:p>
-            <w:pPr>
-              <w:rPr>
-                <w:rFonts w:eastAsia="Arial"/>
-                <w:szCs w:val="21"/>
-              </w:rPr>
-            </w:pPr>
-            <w:r>
-              <w:rPr>
-                <w:rFonts w:eastAsia="Arial"/>
-                <w:b/>
-                <w:bCs/>
-                <w:szCs w:val="21"/>
-              </w:rPr>
-              <w:t xml:space="preserve">Worn</w:t>
-            </w:r>
-            <w:r>
-              <w:rPr>
-                <w:rFonts w:eastAsia="Arial"/>
-                <w:szCs w:val="21"/>
-              </w:rPr>
-              <w:t xml:space="preserve"> — UV, driving rain and freeze–thaw at the surface</w:t>
-            </w:r>
-          </w:p>
-        </w:tc>
-        <w:tc>
-          <w:tcPr>
-            <w:tcW w:w="2910" w:type="dxa"/>
-            <w:tcBorders>
-              <w:right w:val="single" w:sz="6" w:space="0" w:color="auto"/>
-            </w:tcBorders>
-            <w:tcMar>
-              <w:left w:w="90" w:type="dxa"/>
-              <w:right w:w="90" w:type="dxa"/>
-            </w:tcMar>
-          </w:tcPr>
-          <w:p>
-            <w:pPr>
-              <w:rPr>
-                <w:rFonts w:eastAsia="Arial"/>
-                <w:color w:val="C00000"/>
-                <w:szCs w:val="21"/>
-              </w:rPr>
-            </w:pPr>
-            <w:r>
-              <w:rPr>
-                <w:rFonts w:eastAsia="Arial"/>
-                <w:szCs w:val="21"/>
-              </w:rPr>
-              <w:t xml:space="preserve">Biological cycle: timber returns to it only if untreated, or treated with something that breaks down harmlessly, because what weathers off the ribs lands on the pavement below. A naturally durable species, or protection by detailing rather than by chemistry, keeps the ribs in this cycle; the choice is open (Section 3.3.4).</w:t>
-            </w:r>
-          </w:p>
-        </w:tc>
-      </w:tr>
-      <w:tr>
-        <w:trPr>
-          <w:trHeight w:val="285"/>
-        </w:trPr>
-        <w:tc>
-          <w:tcPr>
-            <w:tcW w:w="2910" w:type="dxa"/>
-            <w:tcBorders>
-              <w:left w:val="single" w:sz="6" w:space="0" w:color="auto"/>
-            </w:tcBorders>
-            <w:tcMar>
-              <w:left w:w="90" w:type="dxa"/>
-              <w:right w:w="90" w:type="dxa"/>
-            </w:tcMar>
-          </w:tcPr>
-          <w:p>
-            <w:pPr>
-              <w:rPr>
-                <w:rFonts w:eastAsia="Arial"/>
-                <w:szCs w:val="21"/>
-              </w:rPr>
-            </w:pPr>
-            <w:r>
-              <w:rPr>
-                <w:rFonts w:eastAsia="Arial"/>
-                <w:szCs w:val="21"/>
-              </w:rPr>
-              <w:t xml:space="preserve">Collector panel and its finish</w:t>
-            </w:r>
-          </w:p>
-        </w:tc>
-        <w:tc>
-          <w:tcPr>
-            <w:tcW w:w="2910" w:type="dxa"/>
-            <w:tcMar>
-              <w:left w:w="90" w:type="dxa"/>
-              <w:right w:w="90" w:type="dxa"/>
-            </w:tcMar>
-          </w:tcPr>
-          <w:p>
-            <w:pPr>
-              <w:rPr>
-                <w:rFonts w:eastAsia="Arial"/>
-                <w:szCs w:val="21"/>
-              </w:rPr>
-            </w:pPr>
-            <w:r>
-              <w:rPr>
-                <w:rFonts w:eastAsia="Arial"/>
-                <w:szCs w:val="21"/>
-              </w:rPr>
-              <w:t xml:space="preserve">Worn slowly at the surface; </w:t>
-            </w:r>
-            <w:r>
-              <w:rPr>
-                <w:rFonts w:eastAsia="Arial"/>
-                <w:b/>
-                <w:bCs/>
-                <w:szCs w:val="21"/>
-              </w:rPr>
-              <w:t xml:space="preserve">used</w:t>
-            </w:r>
-            <w:r>
-              <w:rPr>
-                <w:rFonts w:eastAsia="Arial"/>
-                <w:szCs w:val="21"/>
-              </w:rPr>
-              <w:t xml:space="preserve"> as a structure</w:t>
-            </w:r>
-          </w:p>
-        </w:tc>
-        <w:tc>
-          <w:tcPr>
-            <w:tcW w:w="2910" w:type="dxa"/>
-            <w:tcBorders>
-              <w:right w:val="single" w:sz="6" w:space="0" w:color="auto"/>
-            </w:tcBorders>
-            <w:tcMar>
-              <w:left w:w="90" w:type="dxa"/>
-              <w:right w:w="90" w:type="dxa"/>
-            </w:tcMar>
-          </w:tcPr>
-          <w:p>
-            <w:pPr>
-              <w:rPr>
-                <w:rFonts w:eastAsia="Arial"/>
-                <w:color w:val="C00000"/>
-                <w:szCs w:val="21"/>
-              </w:rPr>
-            </w:pPr>
-            <w:r>
-              <w:rPr>
-                <w:rFonts w:eastAsia="Arial"/>
-                <w:szCs w:val="21"/>
-              </w:rPr>
-              <w:t xml:space="preserve">Technical cycle, if the panel is a single recoverable material and its finish is benign. The panel is designed to be removed (Figure 3.8), which is what makes recovery possible.</w:t>
-            </w:r>
-          </w:p>
-        </w:tc>
-      </w:tr>
-      <w:tr>
-        <w:trPr>
-          <w:trHeight w:val="285"/>
-        </w:trPr>
-        <w:tc>
-          <w:tcPr>
-            <w:tcW w:w="2910" w:type="dxa"/>
-            <w:tcBorders>
-              <w:left w:val="single" w:sz="6" w:space="0" w:color="auto"/>
-            </w:tcBorders>
-            <w:tcMar>
-              <w:left w:w="90" w:type="dxa"/>
-              <w:right w:w="90" w:type="dxa"/>
-            </w:tcMar>
-          </w:tcPr>
-          <w:p>
-            <w:pPr>
-              <w:rPr>
-                <w:rFonts w:eastAsia="Arial"/>
-                <w:szCs w:val="21"/>
-              </w:rPr>
-            </w:pPr>
-            <w:r>
-              <w:rPr>
-                <w:rFonts w:eastAsia="Arial"/>
-                <w:szCs w:val="21"/>
-              </w:rPr>
-              <w:t xml:space="preserve">Roof coating</w:t>
-            </w:r>
-          </w:p>
-        </w:tc>
-        <w:tc>
-          <w:tcPr>
-            <w:tcW w:w="2910" w:type="dxa"/>
-            <w:tcMar>
-              <w:left w:w="90" w:type="dxa"/>
-              <w:right w:w="90" w:type="dxa"/>
-            </w:tcMar>
-          </w:tcPr>
-          <w:p>
-            <w:pPr>
-              <w:rPr>
-                <w:rFonts w:eastAsia="Arial"/>
-                <w:szCs w:val="21"/>
-              </w:rPr>
-            </w:pPr>
-            <w:r>
-              <w:rPr>
-                <w:rFonts w:eastAsia="Arial"/>
-                <w:b/>
-                <w:bCs/>
-                <w:szCs w:val="21"/>
-              </w:rPr>
-              <w:t xml:space="preserve">Worn</w:t>
-            </w:r>
-            <w:r>
-              <w:rPr>
-                <w:rFonts w:eastAsia="Arial"/>
-                <w:szCs w:val="21"/>
-              </w:rPr>
-              <w:t xml:space="preserve"> — UV, rain, soiling and cleaning</w:t>
-            </w:r>
-          </w:p>
-        </w:tc>
-        <w:tc>
-          <w:tcPr>
-            <w:tcW w:w="2910" w:type="dxa"/>
-            <w:tcBorders>
-              <w:right w:val="single" w:sz="6" w:space="0" w:color="auto"/>
-            </w:tcBorders>
-            <w:tcMar>
-              <w:left w:w="90" w:type="dxa"/>
-              <w:right w:w="90" w:type="dxa"/>
-            </w:tcMar>
-          </w:tcPr>
-          <w:p>
-            <w:pPr>
-              <w:rPr>
-                <w:rFonts w:eastAsia="Arial"/>
-                <w:color w:val="C00000"/>
-                <w:szCs w:val="21"/>
-              </w:rPr>
-            </w:pPr>
-            <w:r>
-              <w:rPr>
-                <w:rFonts w:eastAsia="Arial"/>
-                <w:szCs w:val="21"/>
-              </w:rPr>
-              <w:t xml:space="preserve">Must be biologically benign in breakdown: it is abraded into roof run-off that reaches the stormwater network. This is also the layer that carries the optical performance, with reflectance 0.95 and emittance 0.90 assumed (Section 3.2.8).</w:t>
-            </w:r>
-          </w:p>
-        </w:tc>
-      </w:tr>
-      <w:tr>
-        <w:trPr>
-          <w:trHeight w:val="285"/>
-        </w:trPr>
-        <w:tc>
-          <w:tcPr>
-            <w:tcW w:w="2910" w:type="dxa"/>
-            <w:tcBorders>
-              <w:left w:val="single" w:sz="6" w:space="0" w:color="auto"/>
-            </w:tcBorders>
-            <w:tcMar>
-              <w:left w:w="90" w:type="dxa"/>
-              <w:right w:w="90" w:type="dxa"/>
-            </w:tcMar>
-          </w:tcPr>
-          <w:p>
-            <w:pPr>
-              <w:rPr>
-                <w:rFonts w:eastAsia="Arial"/>
-                <w:szCs w:val="21"/>
-              </w:rPr>
-            </w:pPr>
-            <w:r>
-              <w:rPr>
-                <w:rFonts w:eastAsia="Arial"/>
-                <w:szCs w:val="21"/>
-              </w:rPr>
-              <w:t xml:space="preserve">Pipework, carrier plate, supports and fixings</w:t>
-            </w:r>
-          </w:p>
-        </w:tc>
-        <w:tc>
-          <w:tcPr>
-            <w:tcW w:w="2910" w:type="dxa"/>
-            <w:tcMar>
-              <w:left w:w="90" w:type="dxa"/>
-              <w:right w:w="90" w:type="dxa"/>
-            </w:tcMar>
-          </w:tcPr>
-          <w:p>
-            <w:pPr>
-              <w:rPr>
-                <w:rFonts w:eastAsia="Arial"/>
-                <w:szCs w:val="21"/>
-              </w:rPr>
-            </w:pPr>
-            <w:r>
-              <w:rPr>
-                <w:rFonts w:eastAsia="Arial"/>
-                <w:b/>
-                <w:bCs/>
-                <w:szCs w:val="21"/>
-              </w:rPr>
-              <w:t xml:space="preserve">Used</w:t>
-            </w:r>
-            <w:r>
-              <w:rPr>
-                <w:rFonts w:eastAsia="Arial"/>
-                <w:szCs w:val="21"/>
-              </w:rPr>
-              <w:t xml:space="preserve">, not consumed</w:t>
-            </w:r>
-          </w:p>
-        </w:tc>
-        <w:tc>
-          <w:tcPr>
-            <w:tcW w:w="2910" w:type="dxa"/>
-            <w:tcBorders>
-              <w:right w:val="single" w:sz="6" w:space="0" w:color="auto"/>
-            </w:tcBorders>
-            <w:tcMar>
-              <w:left w:w="90" w:type="dxa"/>
-              <w:right w:w="90" w:type="dxa"/>
-            </w:tcMar>
-          </w:tcPr>
-          <w:p>
-            <w:pPr>
-              <w:rPr>
-                <w:rFonts w:eastAsia="Arial"/>
-                <w:color w:val="C00000"/>
-                <w:szCs w:val="21"/>
-              </w:rPr>
-            </w:pPr>
-            <w:r>
-              <w:rPr>
-                <w:rFonts w:eastAsia="Arial"/>
-                <w:szCs w:val="21"/>
-              </w:rPr>
-              <w:t xml:space="preserve">Technical cycle: recoverable, and worth specifying as separable single materials. At about 4,620 m of roof pipe plus façade pipes and headers, this is the largest material mass in the build-up, so its recoverability matters most.</w:t>
-            </w:r>
-          </w:p>
-        </w:tc>
-      </w:tr>
-      <w:tr>
-        <w:trPr>
-          <w:trHeight w:val="285"/>
-        </w:trPr>
-        <w:tc>
-          <w:tcPr>
-            <w:tcW w:w="2910" w:type="dxa"/>
-            <w:tcBorders>
-              <w:left w:val="single" w:sz="6" w:space="0" w:color="auto"/>
-            </w:tcBorders>
-            <w:tcMar>
-              <w:left w:w="90" w:type="dxa"/>
-              <w:right w:w="90" w:type="dxa"/>
-            </w:tcMar>
-          </w:tcPr>
-          <w:p>
-            <w:pPr>
-              <w:rPr>
-                <w:rFonts w:eastAsia="Arial"/>
-                <w:szCs w:val="21"/>
-              </w:rPr>
-            </w:pPr>
-            <w:r>
-              <w:rPr>
-                <w:rFonts w:eastAsia="Arial"/>
-                <w:szCs w:val="21"/>
-              </w:rPr>
-              <w:t xml:space="preserve">Water in the loop</w:t>
-            </w:r>
-          </w:p>
-        </w:tc>
-        <w:tc>
-          <w:tcPr>
-            <w:tcW w:w="2910" w:type="dxa"/>
-            <w:tcMar>
-              <w:left w:w="90" w:type="dxa"/>
-              <w:right w:w="90" w:type="dxa"/>
-            </w:tcMar>
-          </w:tcPr>
-          <w:p>
-            <w:pPr>
-              <w:rPr>
-                <w:rFonts w:eastAsia="Arial"/>
-                <w:szCs w:val="21"/>
-              </w:rPr>
-            </w:pPr>
-            <w:r>
-              <w:rPr>
-                <w:rFonts w:eastAsia="Arial"/>
-                <w:b/>
-                <w:bCs/>
-                <w:szCs w:val="21"/>
-              </w:rPr>
-              <w:t xml:space="preserve">Used</w:t>
-            </w:r>
-            <w:r>
-              <w:rPr>
-                <w:rFonts w:eastAsia="Arial"/>
-                <w:szCs w:val="21"/>
-              </w:rPr>
-              <w:t xml:space="preserve">, but mobile</w:t>
-            </w:r>
-          </w:p>
-        </w:tc>
-        <w:tc>
-          <w:tcPr>
-            <w:tcW w:w="2910" w:type="dxa"/>
-            <w:tcBorders>
-              <w:right w:val="single" w:sz="6" w:space="0" w:color="auto"/>
-            </w:tcBorders>
-            <w:tcMar>
-              <w:left w:w="90" w:type="dxa"/>
-              <w:right w:w="90" w:type="dxa"/>
-            </w:tcMar>
-          </w:tcPr>
-          <w:p>
-            <w:pPr>
-              <w:rPr>
-                <w:rFonts w:eastAsia="Arial"/>
-                <w:color w:val="C00000"/>
-                <w:szCs w:val="21"/>
-              </w:rPr>
-            </w:pPr>
-            <w:r>
-              <w:rPr>
-                <w:rFonts w:eastAsia="Arial"/>
-                <w:szCs w:val="21"/>
-              </w:rPr>
-              <w:t xml:space="preserve">Neither cycle cleanly. About 5.8 m³ in the roof pipes alone stays in the loop, is drained to storage each winter and must eventually be disposed of; with an inhibitor added, it would be the one component that can leave the system by accident.</w:t>
-            </w:r>
-          </w:p>
-        </w:tc>
-      </w:tr>
-      <w:tr>
-        <w:trPr>
-          <w:trHeight w:val="285"/>
-        </w:trPr>
-        <w:tc>
-          <w:tcPr>
-            <w:tcW w:w="2910" w:type="dxa"/>
-            <w:tcBorders>
-              <w:left w:val="single" w:sz="6" w:space="0" w:color="auto"/>
-            </w:tcBorders>
-            <w:tcMar>
-              <w:left w:w="90" w:type="dxa"/>
-              <w:right w:w="90" w:type="dxa"/>
-            </w:tcMar>
-          </w:tcPr>
-          <w:p>
-            <w:pPr>
-              <w:rPr>
-                <w:rFonts w:eastAsia="Arial"/>
-                <w:szCs w:val="21"/>
-              </w:rPr>
-            </w:pPr>
-            <w:r>
-              <w:rPr>
-                <w:rFonts w:eastAsia="Arial"/>
-                <w:szCs w:val="21"/>
-              </w:rPr>
-              <w:t xml:space="preserve">Existing wall and roof</w:t>
-            </w:r>
-          </w:p>
-        </w:tc>
-        <w:tc>
-          <w:tcPr>
-            <w:tcW w:w="2910" w:type="dxa"/>
-            <w:tcMar>
-              <w:left w:w="90" w:type="dxa"/>
-              <w:right w:w="90" w:type="dxa"/>
-            </w:tcMar>
-          </w:tcPr>
-          <w:p>
-            <w:pPr>
-              <w:rPr>
-                <w:rFonts w:eastAsia="Arial"/>
-                <w:szCs w:val="21"/>
-              </w:rPr>
-            </w:pPr>
-            <w:r>
-              <w:rPr>
-                <w:rFonts w:eastAsia="Arial"/>
-                <w:szCs w:val="21"/>
-              </w:rPr>
-              <w:t xml:space="preserve">Untouched by the retrofit</w:t>
-            </w:r>
-          </w:p>
-        </w:tc>
-        <w:tc>
-          <w:tcPr>
-            <w:tcW w:w="2910" w:type="dxa"/>
-            <w:tcBorders>
-              <w:right w:val="single" w:sz="6" w:space="0" w:color="auto"/>
-            </w:tcBorders>
-            <w:tcMar>
-              <w:left w:w="90" w:type="dxa"/>
-              <w:right w:w="90" w:type="dxa"/>
-            </w:tcMar>
-          </w:tcPr>
-          <w:p>
-            <w:pPr>
-              <w:rPr>
-                <w:rFonts w:eastAsia="Arial"/>
-                <w:color w:val="C00000"/>
-                <w:szCs w:val="21"/>
-              </w:rPr>
-            </w:pPr>
-            <w:r>
-              <w:rPr>
-                <w:rFonts w:eastAsia="Arial"/>
-                <w:szCs w:val="21"/>
-              </w:rPr>
-              <w:t xml:space="preserve">Outside the product. Retaining them is itself the largest material saving of V2 against a new build.</w:t>
-            </w:r>
-          </w:p>
-        </w:tc>
-      </w:tr>
-    </w:tbl>
-    <w:p>
-      <w:pPr>
-        <w:spacing w:after="40"/>
-        <w:rPr>
-          <w:rFonts w:eastAsia="Arial" w:cs="Arial"/>
-          <w:color w:val="000000" w:themeColor="text1"/>
-          <w:szCs w:val="21"/>
-        </w:rPr>
-      </w:pPr>
+        <w:pStyle w:val="berschrift3"/>
+        <w:rPr>
+          <w:rFonts w:eastAsia="Arial"/>
+        </w:rPr>
+      </w:pPr>
+      <w:r>
+        <w:rPr>
+          <w:rFonts w:eastAsia="Arial"/>
+        </w:rPr>
+        <w:t xml:space="preserve">Limitations</w:t>
+      </w:r>
     </w:p>
     <w:p>
       <w:pPr>
-        <w:pStyle w:val="Beschriftung"/>
-        <w:rPr>
-          <w:rFonts w:eastAsia="Arial" w:cs="Arial"/>
-          <w:noProof w:val="0"/>
-          <w:color w:val="000000" w:themeColor="text1"/>
-        </w:rPr>
-      </w:pPr>
-      <w:r>
-        <w:rPr>
-          <w:rFonts w:eastAsia="Arial" w:cs="Arial"/>
-          <w:noProof w:val="0"/>
-          <w:color w:val="000000" w:themeColor="text1"/>
-        </w:rPr>
-        <w:t xml:space="preserve">Table 4.2 — The wear rule applied to the V2 build-up of Figure 3.5.</w:t>
+        <w:spacing w:after="40"/>
+        <w:rPr>
+          <w:rFonts w:eastAsia="Arial" w:cs="Arial"/>
+          <w:color w:val="000000" w:themeColor="text1"/>
+          <w:szCs w:val="21"/>
+        </w:rPr>
+      </w:pPr>
+      <w:r>
+        <w:rPr>
+          <w:rFonts w:eastAsia="Arial" w:cs="Arial"/>
+          <w:b/>
+          <w:bCs/>
+          <w:color w:val="000000" w:themeColor="text1"/>
+          <w:szCs w:val="21"/>
+        </w:rPr>
+        <w:t xml:space="preserve">A fair-weather benefit.</w:t>
+      </w:r>
+      <w:r>
+        <w:rPr>
+          <w:rFonts w:eastAsia="Arial" w:cs="Arial"/>
+          <w:color w:val="000000" w:themeColor="text1"/>
+          <w:szCs w:val="21"/>
+        </w:rPr>
+        <w:t xml:space="preserve"> The export of heat depends on a clear, dry night sky. In the humid, hazy nights of a heat wave most of the heat only warms the roof air, so the concept helps least in the conditions it is meant for (Section 3.2.8).</w:t>
       </w:r>
     </w:p>
     <w:p>
@@ -1713,29 +523,43 @@
           <w:color w:val="000000" w:themeColor="text1"/>
           <w:szCs w:val="21"/>
         </w:rPr>
-        <w:t xml:space="preserve">The uncomfortable result.</w:t>
-      </w:r>
-      <w:r>
-        <w:rPr>
-          <w:rFonts w:eastAsia="Arial" w:cs="Arial"/>
-          <w:color w:val="000000" w:themeColor="text1"/>
-          <w:szCs w:val="21"/>
-        </w:rPr>
-        <w:t xml:space="preserve"> The two layers that would most readily be engineered with chemistry — the roof coating, where the optical performance lives, and the timber treatment, where the durability lives — are precisely the layers that must be biologically benign, because they are the ones that wear away into the run-off and onto the pavement. That inverts the usual order of a coating specification, in which durability and optical performance are chosen first and the environmental profile is checked afterwards.</w:t>
+        <w:t xml:space="preserve">Idle for most of the year.</w:t>
+      </w:r>
+      <w:r>
+        <w:rPr>
+          <w:rFonts w:eastAsia="Arial" w:cs="Arial"/>
+          <w:color w:val="000000" w:themeColor="text1"/>
+          <w:szCs w:val="21"/>
+        </w:rPr>
+        <w:t xml:space="preserve"> Outside the summer the drained loop does nothing, and no other environmental function fills the gap.</w:t>
       </w:r>
     </w:p>
     <w:p>
       <w:pPr>
-        <w:pStyle w:val="berschrift2"/>
-        <w:rPr>
-          <w:rFonts w:eastAsia="Arial"/>
-        </w:rPr>
-      </w:pPr>
-      <w:r>
-        <w:rPr>
-          <w:rFonts w:eastAsia="Arial"/>
-        </w:rPr>
-        <w:t xml:space="preserve">Circular design principles: status for V2</w:t>
+        <w:spacing w:after="40"/>
+        <w:rPr>
+          <w:rFonts w:eastAsia="Arial" w:cs="Arial"/>
+          <w:color w:val="000000" w:themeColor="text1"/>
+          <w:szCs w:val="21"/>
+        </w:rPr>
+      </w:pPr>
+      <w:r>
+        <w:rPr>
+          <w:rFonts w:eastAsia="Arial" w:cs="Arial"/>
+          <w:b/>
+          <w:bCs/>
+          <w:color w:val="000000" w:themeColor="text1"/>
+          <w:szCs w:val="21"/>
+        </w:rPr>
+        <w:t xml:space="preserve">A benefit without a number.</w:t>
+      </w:r>
+      <w:r>
+        <w:rPr>
+          <w:rFonts w:eastAsia="Arial" w:cs="Arial"/>
+          <w:color w:val="000000" w:themeColor="text1"/>
+          <w:szCs w:val="21"/>
+        </w:rPr>
+        <w:t xml:space="preserve"> No cooling figure exists, so the avoided emissions cannot be counted, and the whole benefit rests on circulation without a pump, the first open check of Table 3.13.</w:t>
       </w:r>
     </w:p>
     <w:p>
@@ -1750,1064 +574,34 @@
       <w:r>
         <w:rPr>
           <w:rFonts w:eastAsia="Arial" w:cs="Arial"/>
-          <w:color w:val="000000" w:themeColor="text1"/>
-          <w:szCs w:val="21"/>
-        </w:rPr>
-        <w:t xml:space="preserve">Table 4.3 takes the eight cycle design principles of the Cradle to Cradle lecture </w:t>
-      </w:r>
-      <w:r>
-        <w:rPr>
-          <w:rFonts w:eastAsia="Arial" w:cs="Arial"/>
-          <w:color w:val="000000" w:themeColor="text1"/>
-          <w:szCs w:val="21"/>
-          <w:highlight w:val="yellow"/>
-        </w:rPr>
-        <w:t xml:space="preserve">(ZHAW Blockweek Bionics, Cradle to Cradle lecture, 2026)</w:t>
-      </w:r>
-      <w:r>
-        <w:rPr>
-          <w:rFonts w:eastAsia="Arial" w:cs="Arial"/>
-          <w:color w:val="000000" w:themeColor="text1"/>
-          <w:szCs w:val="21"/>
-        </w:rPr>
-        <w:t xml:space="preserve"> and states, for each, what V2 has answered and on what evidence. A principle ticked without evidence would be worth nothing here, so the evidence column is the one to read.</w:t>
-      </w:r>
-    </w:p>
-    <w:tbl>
-      <w:tblPr>
-        <w:tblW w:w="0" w:type="auto"/>
-        <w:tblBorders>
-          <w:top w:val="single" w:sz="6" w:space="0" w:color="auto"/>
-          <w:left w:val="single" w:sz="6" w:space="0" w:color="auto"/>
-          <w:bottom w:val="single" w:sz="6" w:space="0" w:color="auto"/>
-          <w:right w:val="single" w:sz="6" w:space="0" w:color="auto"/>
-          <w:insideH w:val="single" w:sz="4" w:space="0" w:color="auto"/>
-          <w:insideV w:val="single" w:sz="4" w:space="0" w:color="auto"/>
-        </w:tblBorders>
-        <w:tblLook w:val="04A0" w:firstRow="1" w:lastRow="0" w:firstColumn="1" w:lastColumn="0" w:noHBand="0" w:noVBand="1"/>
-      </w:tblPr>
-      <w:tblGrid>
-        <w:gridCol w:w="615"/>
-        <w:gridCol w:w="2820"/>
-        <w:gridCol w:w="1800"/>
-        <w:gridCol w:w="3525"/>
-      </w:tblGrid>
-      <w:tr>
-        <w:trPr>
-          <w:trHeight w:val="285"/>
-        </w:trPr>
-        <w:tc>
-          <w:tcPr>
-            <w:tcW w:w="615" w:type="dxa"/>
-            <w:tcBorders>
-              <w:top w:val="single" w:sz="6" w:space="0" w:color="auto"/>
-              <w:left w:val="single" w:sz="6" w:space="0" w:color="auto"/>
-            </w:tcBorders>
-            <w:tcMar>
-              <w:left w:w="90" w:type="dxa"/>
-              <w:right w:w="90" w:type="dxa"/>
-            </w:tcMar>
-          </w:tcPr>
-          <w:p>
-            <w:pPr>
-              <w:rPr>
-                <w:rFonts w:eastAsia="Arial"/>
-                <w:szCs w:val="21"/>
-              </w:rPr>
-            </w:pPr>
-            <w:r>
-              <w:rPr>
-                <w:rFonts w:eastAsia="Arial"/>
-                <w:b/>
-                <w:bCs/>
-                <w:szCs w:val="21"/>
-              </w:rPr>
-              <w:t xml:space="preserve">#</w:t>
-            </w:r>
-          </w:p>
-        </w:tc>
-        <w:tc>
-          <w:tcPr>
-            <w:tcW w:w="2820" w:type="dxa"/>
-            <w:tcBorders>
-              <w:top w:val="single" w:sz="6" w:space="0" w:color="auto"/>
-            </w:tcBorders>
-            <w:tcMar>
-              <w:left w:w="90" w:type="dxa"/>
-              <w:right w:w="90" w:type="dxa"/>
-            </w:tcMar>
-          </w:tcPr>
-          <w:p>
-            <w:pPr>
-              <w:rPr>
-                <w:rFonts w:eastAsia="Arial"/>
-                <w:szCs w:val="21"/>
-              </w:rPr>
-            </w:pPr>
-            <w:r>
-              <w:rPr>
-                <w:rFonts w:eastAsia="Arial"/>
-                <w:b/>
-                <w:bCs/>
-                <w:szCs w:val="21"/>
-              </w:rPr>
-              <w:t xml:space="preserve">Principle</w:t>
-            </w:r>
-          </w:p>
-        </w:tc>
-        <w:tc>
-          <w:tcPr>
-            <w:tcW w:w="1800" w:type="dxa"/>
-            <w:tcBorders>
-              <w:top w:val="single" w:sz="6" w:space="0" w:color="auto"/>
-            </w:tcBorders>
-            <w:tcMar>
-              <w:left w:w="90" w:type="dxa"/>
-              <w:right w:w="90" w:type="dxa"/>
-            </w:tcMar>
-          </w:tcPr>
-          <w:p>
-            <w:pPr>
-              <w:rPr>
-                <w:rFonts w:eastAsia="Arial"/>
-                <w:szCs w:val="21"/>
-              </w:rPr>
-            </w:pPr>
-            <w:r>
-              <w:rPr>
-                <w:rFonts w:eastAsia="Arial"/>
-                <w:b/>
-                <w:bCs/>
-                <w:szCs w:val="21"/>
-              </w:rPr>
-              <w:t xml:space="preserve">Status</w:t>
-            </w:r>
-          </w:p>
-        </w:tc>
-        <w:tc>
-          <w:tcPr>
-            <w:tcW w:w="3525" w:type="dxa"/>
-            <w:tcBorders>
-              <w:top w:val="single" w:sz="6" w:space="0" w:color="auto"/>
-              <w:right w:val="single" w:sz="6" w:space="0" w:color="auto"/>
-            </w:tcBorders>
-            <w:tcMar>
-              <w:left w:w="90" w:type="dxa"/>
-              <w:right w:w="90" w:type="dxa"/>
-            </w:tcMar>
-          </w:tcPr>
-          <w:p>
-            <w:pPr>
-              <w:rPr>
-                <w:rFonts w:eastAsia="Arial"/>
-                <w:szCs w:val="21"/>
-              </w:rPr>
-            </w:pPr>
-            <w:r>
-              <w:rPr>
-                <w:rFonts w:eastAsia="Arial"/>
-                <w:b/>
-                <w:bCs/>
-                <w:szCs w:val="21"/>
-              </w:rPr>
-              <w:t xml:space="preserve">Evidence or reason</w:t>
-            </w:r>
-          </w:p>
-        </w:tc>
-      </w:tr>
-      <w:tr>
-        <w:trPr>
-          <w:trHeight w:val="285"/>
-        </w:trPr>
-        <w:tc>
-          <w:tcPr>
-            <w:tcW w:w="615" w:type="dxa"/>
-            <w:tcBorders>
-              <w:left w:val="single" w:sz="6" w:space="0" w:color="auto"/>
-            </w:tcBorders>
-            <w:tcMar>
-              <w:left w:w="90" w:type="dxa"/>
-              <w:right w:w="90" w:type="dxa"/>
-            </w:tcMar>
-          </w:tcPr>
-          <w:p>
-            <w:pPr>
-              <w:rPr>
-                <w:rFonts w:eastAsia="Arial"/>
-                <w:szCs w:val="21"/>
-              </w:rPr>
-            </w:pPr>
-            <w:r>
-              <w:rPr>
-                <w:rFonts w:eastAsia="Arial"/>
-                <w:szCs w:val="21"/>
-              </w:rPr>
-              <w:t xml:space="preserve">1</w:t>
-            </w:r>
-          </w:p>
-        </w:tc>
-        <w:tc>
-          <w:tcPr>
-            <w:tcW w:w="2820" w:type="dxa"/>
-            <w:tcMar>
-              <w:left w:w="90" w:type="dxa"/>
-              <w:right w:w="90" w:type="dxa"/>
-            </w:tcMar>
-          </w:tcPr>
-          <w:p>
-            <w:pPr>
-              <w:rPr>
-                <w:rFonts w:eastAsia="Arial"/>
-                <w:szCs w:val="21"/>
-              </w:rPr>
-            </w:pPr>
-            <w:r>
-              <w:rPr>
-                <w:rFonts w:eastAsia="Arial"/>
-                <w:szCs w:val="21"/>
-              </w:rPr>
-              <w:t xml:space="preserve">No ecotoxic chemicals</w:t>
-            </w:r>
-          </w:p>
-        </w:tc>
-        <w:tc>
-          <w:tcPr>
-            <w:tcW w:w="1800" w:type="dxa"/>
-            <w:tcMar>
-              <w:left w:w="90" w:type="dxa"/>
-              <w:right w:w="90" w:type="dxa"/>
-            </w:tcMar>
-          </w:tcPr>
-          <w:p>
-            <w:pPr>
-              <w:rPr>
-                <w:rFonts w:eastAsia="Arial"/>
-                <w:szCs w:val="21"/>
-              </w:rPr>
-            </w:pPr>
-            <w:r>
-              <w:rPr>
-                <w:rFonts w:eastAsia="Arial"/>
-                <w:szCs w:val="21"/>
-              </w:rPr>
-              <w:t xml:space="preserve">Partly answered</w:t>
-            </w:r>
-          </w:p>
-        </w:tc>
-        <w:tc>
-          <w:tcPr>
-            <w:tcW w:w="3525" w:type="dxa"/>
-            <w:tcBorders>
-              <w:right w:val="single" w:sz="6" w:space="0" w:color="auto"/>
-            </w:tcBorders>
-            <w:tcMar>
-              <w:left w:w="90" w:type="dxa"/>
-              <w:right w:w="90" w:type="dxa"/>
-            </w:tcMar>
-          </w:tcPr>
-          <w:p>
-            <w:pPr>
-              <w:rPr>
-                <w:rFonts w:eastAsia="Arial"/>
-                <w:szCs w:val="21"/>
-              </w:rPr>
-            </w:pPr>
-            <w:r>
-              <w:rPr>
-                <w:rFonts w:eastAsia="Arial"/>
-                <w:szCs w:val="21"/>
-              </w:rPr>
-              <w:t xml:space="preserve">Water instead of glycol (Section 3.3.5). Timber treatment, roof coating and any inhibitor are not yet checked; see Section 4.7.</w:t>
-            </w:r>
-          </w:p>
-        </w:tc>
-      </w:tr>
-      <w:tr>
-        <w:trPr>
-          <w:trHeight w:val="285"/>
-        </w:trPr>
-        <w:tc>
-          <w:tcPr>
-            <w:tcW w:w="615" w:type="dxa"/>
-            <w:tcBorders>
-              <w:left w:val="single" w:sz="6" w:space="0" w:color="auto"/>
-            </w:tcBorders>
-            <w:tcMar>
-              <w:left w:w="90" w:type="dxa"/>
-              <w:right w:w="90" w:type="dxa"/>
-            </w:tcMar>
-          </w:tcPr>
-          <w:p>
-            <w:pPr>
-              <w:rPr>
-                <w:rFonts w:eastAsia="Arial"/>
-                <w:szCs w:val="21"/>
-              </w:rPr>
-            </w:pPr>
-            <w:r>
-              <w:rPr>
-                <w:rFonts w:eastAsia="Arial"/>
-                <w:szCs w:val="21"/>
-              </w:rPr>
-              <w:t xml:space="preserve">2</w:t>
-            </w:r>
-          </w:p>
-        </w:tc>
-        <w:tc>
-          <w:tcPr>
-            <w:tcW w:w="2820" w:type="dxa"/>
-            <w:tcMar>
-              <w:left w:w="90" w:type="dxa"/>
-              <w:right w:w="90" w:type="dxa"/>
-            </w:tcMar>
-          </w:tcPr>
-          <w:p>
-            <w:pPr>
-              <w:rPr>
-                <w:rFonts w:eastAsia="Arial"/>
-                <w:szCs w:val="21"/>
-              </w:rPr>
-            </w:pPr>
-            <w:r>
-              <w:rPr>
-                <w:rFonts w:eastAsia="Arial"/>
-                <w:szCs w:val="21"/>
-              </w:rPr>
-              <w:t xml:space="preserve">Recyclable materials</w:t>
-            </w:r>
-          </w:p>
-        </w:tc>
-        <w:tc>
-          <w:tcPr>
-            <w:tcW w:w="1800" w:type="dxa"/>
-            <w:tcMar>
-              <w:left w:w="90" w:type="dxa"/>
-              <w:right w:w="90" w:type="dxa"/>
-            </w:tcMar>
-          </w:tcPr>
-          <w:p>
-            <w:pPr>
-              <w:rPr>
-                <w:rFonts w:eastAsia="Arial"/>
-                <w:szCs w:val="21"/>
-              </w:rPr>
-            </w:pPr>
-            <w:r>
-              <w:rPr>
-                <w:rFonts w:eastAsia="Arial"/>
-                <w:szCs w:val="21"/>
-              </w:rPr>
-              <w:t xml:space="preserve">Partly answered</w:t>
-            </w:r>
-          </w:p>
-        </w:tc>
-        <w:tc>
-          <w:tcPr>
-            <w:tcW w:w="3525" w:type="dxa"/>
-            <w:tcBorders>
-              <w:right w:val="single" w:sz="6" w:space="0" w:color="auto"/>
-            </w:tcBorders>
-            <w:tcMar>
-              <w:left w:w="90" w:type="dxa"/>
-              <w:right w:w="90" w:type="dxa"/>
-            </w:tcMar>
-          </w:tcPr>
-          <w:p>
-            <w:pPr>
-              <w:rPr>
-                <w:rFonts w:eastAsia="Arial"/>
-                <w:szCs w:val="21"/>
-              </w:rPr>
-            </w:pPr>
-            <w:r>
-              <w:rPr>
-                <w:rFonts w:eastAsia="Arial"/>
-                <w:szCs w:val="21"/>
-              </w:rPr>
-              <w:t xml:space="preserve">Pipes, carrier plate and supports can be specified as single materials; the coated panel and the coated plate are composites whose separability is not decided.</w:t>
-            </w:r>
-          </w:p>
-        </w:tc>
-      </w:tr>
-      <w:tr>
-        <w:trPr>
-          <w:trHeight w:val="285"/>
-        </w:trPr>
-        <w:tc>
-          <w:tcPr>
-            <w:tcW w:w="615" w:type="dxa"/>
-            <w:tcBorders>
-              <w:left w:val="single" w:sz="6" w:space="0" w:color="auto"/>
-            </w:tcBorders>
-            <w:tcMar>
-              <w:left w:w="90" w:type="dxa"/>
-              <w:right w:w="90" w:type="dxa"/>
-            </w:tcMar>
-          </w:tcPr>
-          <w:p>
-            <w:pPr>
-              <w:rPr>
-                <w:rFonts w:eastAsia="Arial"/>
-                <w:szCs w:val="21"/>
-              </w:rPr>
-            </w:pPr>
-            <w:r>
-              <w:rPr>
-                <w:rFonts w:eastAsia="Arial"/>
-                <w:szCs w:val="21"/>
-              </w:rPr>
-              <w:t xml:space="preserve">3</w:t>
-            </w:r>
-          </w:p>
-        </w:tc>
-        <w:tc>
-          <w:tcPr>
-            <w:tcW w:w="2820" w:type="dxa"/>
-            <w:tcMar>
-              <w:left w:w="90" w:type="dxa"/>
-              <w:right w:w="90" w:type="dxa"/>
-            </w:tcMar>
-          </w:tcPr>
-          <w:p>
-            <w:pPr>
-              <w:rPr>
-                <w:rFonts w:eastAsia="Arial"/>
-                <w:szCs w:val="21"/>
-              </w:rPr>
-            </w:pPr>
-            <w:r>
-              <w:rPr>
-                <w:rFonts w:eastAsia="Arial"/>
-                <w:szCs w:val="21"/>
-              </w:rPr>
-              <w:t xml:space="preserve">Easy to dismantle, modular</w:t>
-            </w:r>
-          </w:p>
-        </w:tc>
-        <w:tc>
-          <w:tcPr>
-            <w:tcW w:w="1800" w:type="dxa"/>
-            <w:tcMar>
-              <w:left w:w="90" w:type="dxa"/>
-              <w:right w:w="90" w:type="dxa"/>
-            </w:tcMar>
-          </w:tcPr>
-          <w:p>
-            <w:pPr>
-              <w:rPr>
-                <w:rFonts w:eastAsia="Arial"/>
-                <w:szCs w:val="21"/>
-              </w:rPr>
-            </w:pPr>
-            <w:r>
-              <w:rPr>
-                <w:rFonts w:eastAsia="Arial"/>
-                <w:b/>
-                <w:bCs/>
-                <w:szCs w:val="21"/>
-              </w:rPr>
-              <w:t xml:space="preserve">Answered in principle</w:t>
-            </w:r>
-          </w:p>
-        </w:tc>
-        <w:tc>
-          <w:tcPr>
-            <w:tcW w:w="3525" w:type="dxa"/>
-            <w:tcBorders>
-              <w:right w:val="single" w:sz="6" w:space="0" w:color="auto"/>
-            </w:tcBorders>
-            <w:tcMar>
-              <w:left w:w="90" w:type="dxa"/>
-              <w:right w:w="90" w:type="dxa"/>
-            </w:tcMar>
-          </w:tcPr>
-          <w:p>
-            <w:pPr>
-              <w:rPr>
-                <w:rFonts w:eastAsia="Arial"/>
-                <w:szCs w:val="21"/>
-              </w:rPr>
-            </w:pPr>
-            <w:r>
-              <w:rPr>
-                <w:rFonts w:eastAsia="Arial"/>
-                <w:szCs w:val="21"/>
-              </w:rPr>
-              <w:t xml:space="preserve">V2 moved the pipes out of the wall into separable panels, so the wall is retained and components can be removed (Sections 3.3.2–3.3.4, Figure 3.8). Fixings are not detailed.</w:t>
-            </w:r>
-          </w:p>
-        </w:tc>
-      </w:tr>
-      <w:tr>
-        <w:trPr>
-          <w:trHeight w:val="285"/>
-        </w:trPr>
-        <w:tc>
-          <w:tcPr>
-            <w:tcW w:w="615" w:type="dxa"/>
-            <w:tcBorders>
-              <w:left w:val="single" w:sz="6" w:space="0" w:color="auto"/>
-            </w:tcBorders>
-            <w:tcMar>
-              <w:left w:w="90" w:type="dxa"/>
-              <w:right w:w="90" w:type="dxa"/>
-            </w:tcMar>
-          </w:tcPr>
-          <w:p>
-            <w:pPr>
-              <w:rPr>
-                <w:rFonts w:eastAsia="Arial"/>
-                <w:szCs w:val="21"/>
-              </w:rPr>
-            </w:pPr>
-            <w:r>
-              <w:rPr>
-                <w:rFonts w:eastAsia="Arial"/>
-                <w:szCs w:val="21"/>
-              </w:rPr>
-              <w:t xml:space="preserve">4</w:t>
-            </w:r>
-          </w:p>
-        </w:tc>
-        <w:tc>
-          <w:tcPr>
-            <w:tcW w:w="2820" w:type="dxa"/>
-            <w:tcMar>
-              <w:left w:w="90" w:type="dxa"/>
-              <w:right w:w="90" w:type="dxa"/>
-            </w:tcMar>
-          </w:tcPr>
-          <w:p>
-            <w:pPr>
-              <w:rPr>
-                <w:rFonts w:eastAsia="Arial"/>
-                <w:szCs w:val="21"/>
-              </w:rPr>
-            </w:pPr>
-            <w:r>
-              <w:rPr>
-                <w:rFonts w:eastAsia="Arial"/>
-                <w:szCs w:val="21"/>
-              </w:rPr>
-              <w:t xml:space="preserve">Durability</w:t>
-            </w:r>
-          </w:p>
-        </w:tc>
-        <w:tc>
-          <w:tcPr>
-            <w:tcW w:w="1800" w:type="dxa"/>
-            <w:tcMar>
-              <w:left w:w="90" w:type="dxa"/>
-              <w:right w:w="90" w:type="dxa"/>
-            </w:tcMar>
-          </w:tcPr>
-          <w:p>
-            <w:pPr>
-              <w:rPr>
-                <w:rFonts w:eastAsia="Arial"/>
-                <w:szCs w:val="21"/>
-              </w:rPr>
-            </w:pPr>
-            <w:r>
-              <w:rPr>
-                <w:rFonts w:eastAsia="Arial"/>
-                <w:szCs w:val="21"/>
-              </w:rPr>
-              <w:t xml:space="preserve">Partly answered</w:t>
-            </w:r>
-          </w:p>
-        </w:tc>
-        <w:tc>
-          <w:tcPr>
-            <w:tcW w:w="3525" w:type="dxa"/>
-            <w:tcBorders>
-              <w:right w:val="single" w:sz="6" w:space="0" w:color="auto"/>
-            </w:tcBorders>
-            <w:tcMar>
-              <w:left w:w="90" w:type="dxa"/>
-              <w:right w:w="90" w:type="dxa"/>
-            </w:tcMar>
-          </w:tcPr>
-          <w:p>
-            <w:pPr>
-              <w:rPr>
-                <w:rFonts w:eastAsia="Arial"/>
-                <w:szCs w:val="21"/>
-              </w:rPr>
-            </w:pPr>
-            <w:r>
-              <w:rPr>
-                <w:rFonts w:eastAsia="Arial"/>
-                <w:szCs w:val="21"/>
-              </w:rPr>
-              <w:t xml:space="preserve">KPI 6 defines an efficiency factor after a set time, and the Climate constraint fixes the exposure (Table 2.1); no target value and no ageing data exist (Table 3.10).</w:t>
-            </w:r>
-          </w:p>
-        </w:tc>
-      </w:tr>
-      <w:tr>
-        <w:trPr>
-          <w:trHeight w:val="285"/>
-        </w:trPr>
-        <w:tc>
-          <w:tcPr>
-            <w:tcW w:w="615" w:type="dxa"/>
-            <w:tcBorders>
-              <w:left w:val="single" w:sz="6" w:space="0" w:color="auto"/>
-            </w:tcBorders>
-            <w:tcMar>
-              <w:left w:w="90" w:type="dxa"/>
-              <w:right w:w="90" w:type="dxa"/>
-            </w:tcMar>
-          </w:tcPr>
-          <w:p>
-            <w:pPr>
-              <w:rPr>
-                <w:rFonts w:eastAsia="Arial"/>
-                <w:szCs w:val="21"/>
-              </w:rPr>
-            </w:pPr>
-            <w:r>
-              <w:rPr>
-                <w:rFonts w:eastAsia="Arial"/>
-                <w:szCs w:val="21"/>
-              </w:rPr>
-              <w:t xml:space="preserve">5</w:t>
-            </w:r>
-          </w:p>
-        </w:tc>
-        <w:tc>
-          <w:tcPr>
-            <w:tcW w:w="2820" w:type="dxa"/>
-            <w:tcMar>
-              <w:left w:w="90" w:type="dxa"/>
-              <w:right w:w="90" w:type="dxa"/>
-            </w:tcMar>
-          </w:tcPr>
-          <w:p>
-            <w:pPr>
-              <w:rPr>
-                <w:rFonts w:eastAsia="Arial"/>
-                <w:szCs w:val="21"/>
-              </w:rPr>
-            </w:pPr>
-            <w:r>
-              <w:rPr>
-                <w:rFonts w:eastAsia="Arial"/>
-                <w:szCs w:val="21"/>
-              </w:rPr>
-              <w:t xml:space="preserve">Simple maintainability and reparability</w:t>
-            </w:r>
-          </w:p>
-        </w:tc>
-        <w:tc>
-          <w:tcPr>
-            <w:tcW w:w="1800" w:type="dxa"/>
-            <w:tcMar>
-              <w:left w:w="90" w:type="dxa"/>
-              <w:right w:w="90" w:type="dxa"/>
-            </w:tcMar>
-          </w:tcPr>
-          <w:p>
-            <w:pPr>
-              <w:rPr>
-                <w:rFonts w:eastAsia="Arial"/>
-                <w:szCs w:val="21"/>
-              </w:rPr>
-            </w:pPr>
-            <w:r>
-              <w:rPr>
-                <w:rFonts w:eastAsia="Arial"/>
-                <w:b/>
-                <w:bCs/>
-                <w:szCs w:val="21"/>
-              </w:rPr>
-              <w:t xml:space="preserve">Answered for the façade</w:t>
-            </w:r>
-          </w:p>
-        </w:tc>
-        <w:tc>
-          <w:tcPr>
-            <w:tcW w:w="3525" w:type="dxa"/>
-            <w:tcBorders>
-              <w:right w:val="single" w:sz="6" w:space="0" w:color="auto"/>
-            </w:tcBorders>
-            <w:tcMar>
-              <w:left w:w="90" w:type="dxa"/>
-              <w:right w:w="90" w:type="dxa"/>
-            </w:tcMar>
-          </w:tcPr>
-          <w:p>
-            <w:pPr>
-              <w:rPr>
-                <w:rFonts w:eastAsia="Arial"/>
-                <w:szCs w:val="21"/>
-              </w:rPr>
-            </w:pPr>
-            <w:r>
-              <w:rPr>
-                <w:rFonts w:eastAsia="Arial"/>
-                <w:szCs w:val="21"/>
-              </w:rPr>
-              <w:t xml:space="preserve">Removing a panel exposes the façade pipes for inspection and repair without opening the wall (Figure 3.8). The roof pipes lie under the carrier plate and cannot be reached the same way.</w:t>
-            </w:r>
-          </w:p>
-        </w:tc>
-      </w:tr>
-      <w:tr>
-        <w:trPr>
-          <w:trHeight w:val="285"/>
-        </w:trPr>
-        <w:tc>
-          <w:tcPr>
-            <w:tcW w:w="615" w:type="dxa"/>
-            <w:tcBorders>
-              <w:left w:val="single" w:sz="6" w:space="0" w:color="auto"/>
-            </w:tcBorders>
-            <w:tcMar>
-              <w:left w:w="90" w:type="dxa"/>
-              <w:right w:w="90" w:type="dxa"/>
-            </w:tcMar>
-          </w:tcPr>
-          <w:p>
-            <w:pPr>
-              <w:rPr>
-                <w:rFonts w:eastAsia="Arial"/>
-                <w:szCs w:val="21"/>
-              </w:rPr>
-            </w:pPr>
-            <w:r>
-              <w:rPr>
-                <w:rFonts w:eastAsia="Arial"/>
-                <w:szCs w:val="21"/>
-              </w:rPr>
-              <w:t xml:space="preserve">6</w:t>
-            </w:r>
-          </w:p>
-        </w:tc>
-        <w:tc>
-          <w:tcPr>
-            <w:tcW w:w="2820" w:type="dxa"/>
-            <w:tcMar>
-              <w:left w:w="90" w:type="dxa"/>
-              <w:right w:w="90" w:type="dxa"/>
-            </w:tcMar>
-          </w:tcPr>
-          <w:p>
-            <w:pPr>
-              <w:rPr>
-                <w:rFonts w:eastAsia="Arial"/>
-                <w:szCs w:val="21"/>
-              </w:rPr>
-            </w:pPr>
-            <w:r>
-              <w:rPr>
-                <w:rFonts w:eastAsia="Arial"/>
-                <w:szCs w:val="21"/>
-              </w:rPr>
-              <w:t xml:space="preserve">Cascade use of raw materials</w:t>
-            </w:r>
-          </w:p>
-        </w:tc>
-        <w:tc>
-          <w:tcPr>
-            <w:tcW w:w="1800" w:type="dxa"/>
-            <w:tcMar>
-              <w:left w:w="90" w:type="dxa"/>
-              <w:right w:w="90" w:type="dxa"/>
-            </w:tcMar>
-          </w:tcPr>
-          <w:p>
-            <w:pPr>
-              <w:rPr>
-                <w:rFonts w:eastAsia="Arial"/>
-                <w:szCs w:val="21"/>
-              </w:rPr>
-            </w:pPr>
-            <w:r>
-              <w:rPr>
-                <w:rFonts w:eastAsia="Arial"/>
-                <w:b/>
-                <w:bCs/>
-                <w:szCs w:val="21"/>
-              </w:rPr>
-              <w:t xml:space="preserve">Not addressed</w:t>
-            </w:r>
-          </w:p>
-        </w:tc>
-        <w:tc>
-          <w:tcPr>
-            <w:tcW w:w="3525" w:type="dxa"/>
-            <w:tcBorders>
-              <w:right w:val="single" w:sz="6" w:space="0" w:color="auto"/>
-            </w:tcBorders>
-            <w:tcMar>
-              <w:left w:w="90" w:type="dxa"/>
-              <w:right w:w="90" w:type="dxa"/>
-            </w:tcMar>
-          </w:tcPr>
-          <w:p>
-            <w:pPr>
-              <w:rPr>
-                <w:rFonts w:eastAsia="Arial"/>
-                <w:szCs w:val="21"/>
-              </w:rPr>
-            </w:pPr>
-            <w:r>
-              <w:rPr>
-                <w:rFonts w:eastAsia="Arial"/>
-                <w:szCs w:val="21"/>
-              </w:rPr>
-              <w:t xml:space="preserve">Nothing in the concept anticipates a second life. The timber ribs are the one layer with an obvious cascade — structural timber, then board, then energy — but it is not planned.</w:t>
-            </w:r>
-          </w:p>
-        </w:tc>
-      </w:tr>
-      <w:tr>
-        <w:trPr>
-          <w:trHeight w:val="285"/>
-        </w:trPr>
-        <w:tc>
-          <w:tcPr>
-            <w:tcW w:w="615" w:type="dxa"/>
-            <w:tcBorders>
-              <w:left w:val="single" w:sz="6" w:space="0" w:color="auto"/>
-            </w:tcBorders>
-            <w:tcMar>
-              <w:left w:w="90" w:type="dxa"/>
-              <w:right w:w="90" w:type="dxa"/>
-            </w:tcMar>
-          </w:tcPr>
-          <w:p>
-            <w:pPr>
-              <w:rPr>
-                <w:rFonts w:eastAsia="Arial"/>
-                <w:szCs w:val="21"/>
-              </w:rPr>
-            </w:pPr>
-            <w:r>
-              <w:rPr>
-                <w:rFonts w:eastAsia="Arial"/>
-                <w:szCs w:val="21"/>
-              </w:rPr>
-              <w:t xml:space="preserve">7</w:t>
-            </w:r>
-          </w:p>
-        </w:tc>
-        <w:tc>
-          <w:tcPr>
-            <w:tcW w:w="2820" w:type="dxa"/>
-            <w:tcMar>
-              <w:left w:w="90" w:type="dxa"/>
-              <w:right w:w="90" w:type="dxa"/>
-            </w:tcMar>
-          </w:tcPr>
-          <w:p>
-            <w:pPr>
-              <w:rPr>
-                <w:rFonts w:eastAsia="Arial"/>
-                <w:szCs w:val="21"/>
-              </w:rPr>
-            </w:pPr>
-            <w:r>
-              <w:rPr>
-                <w:rFonts w:eastAsia="Arial"/>
-                <w:szCs w:val="21"/>
-              </w:rPr>
-              <w:t xml:space="preserve">Planned return logistics</w:t>
-            </w:r>
-          </w:p>
-        </w:tc>
-        <w:tc>
-          <w:tcPr>
-            <w:tcW w:w="1800" w:type="dxa"/>
-            <w:tcMar>
-              <w:left w:w="90" w:type="dxa"/>
-              <w:right w:w="90" w:type="dxa"/>
-            </w:tcMar>
-          </w:tcPr>
-          <w:p>
-            <w:pPr>
-              <w:rPr>
-                <w:rFonts w:eastAsia="Arial"/>
-                <w:szCs w:val="21"/>
-              </w:rPr>
-            </w:pPr>
-            <w:r>
-              <w:rPr>
-                <w:rFonts w:eastAsia="Arial"/>
-                <w:b/>
-                <w:bCs/>
-                <w:szCs w:val="21"/>
-              </w:rPr>
-              <w:t xml:space="preserve">Out of boundary</w:t>
-            </w:r>
-          </w:p>
-        </w:tc>
-        <w:tc>
-          <w:tcPr>
-            <w:tcW w:w="3525" w:type="dxa"/>
-            <w:tcBorders>
-              <w:right w:val="single" w:sz="6" w:space="0" w:color="auto"/>
-            </w:tcBorders>
-            <w:tcMar>
-              <w:left w:w="90" w:type="dxa"/>
-              <w:right w:w="90" w:type="dxa"/>
-            </w:tcMar>
-          </w:tcPr>
-          <w:p>
-            <w:pPr>
-              <w:rPr>
-                <w:rFonts w:eastAsia="Arial"/>
-                <w:szCs w:val="21"/>
-              </w:rPr>
-            </w:pPr>
-            <w:r>
-              <w:rPr>
-                <w:rFonts w:eastAsia="Arial"/>
-                <w:szCs w:val="21"/>
-              </w:rPr>
-              <w:t xml:space="preserve">Requires a business model. Table 2.2 confines the project to the façade and roof, and no ownership model is designed.</w:t>
-            </w:r>
-          </w:p>
-        </w:tc>
-      </w:tr>
-      <w:tr>
-        <w:trPr>
-          <w:trHeight w:val="285"/>
-        </w:trPr>
-        <w:tc>
-          <w:tcPr>
-            <w:tcW w:w="615" w:type="dxa"/>
-            <w:tcBorders>
-              <w:left w:val="single" w:sz="6" w:space="0" w:color="auto"/>
-            </w:tcBorders>
-            <w:tcMar>
-              <w:left w:w="90" w:type="dxa"/>
-              <w:right w:w="90" w:type="dxa"/>
-            </w:tcMar>
-          </w:tcPr>
-          <w:p>
-            <w:pPr>
-              <w:rPr>
-                <w:rFonts w:eastAsia="Arial"/>
-                <w:szCs w:val="21"/>
-              </w:rPr>
-            </w:pPr>
-            <w:r>
-              <w:rPr>
-                <w:rFonts w:eastAsia="Arial"/>
-                <w:szCs w:val="21"/>
-              </w:rPr>
-              <w:t xml:space="preserve">8</w:t>
-            </w:r>
-          </w:p>
-        </w:tc>
-        <w:tc>
-          <w:tcPr>
-            <w:tcW w:w="2820" w:type="dxa"/>
-            <w:tcMar>
-              <w:left w:w="90" w:type="dxa"/>
-              <w:right w:w="90" w:type="dxa"/>
-            </w:tcMar>
-          </w:tcPr>
-          <w:p>
-            <w:pPr>
-              <w:rPr>
-                <w:rFonts w:eastAsia="Arial"/>
-                <w:szCs w:val="21"/>
-              </w:rPr>
-            </w:pPr>
-            <w:r>
-              <w:rPr>
-                <w:rFonts w:eastAsia="Arial"/>
-                <w:szCs w:val="21"/>
-              </w:rPr>
-              <w:t xml:space="preserve">Efficient use of energy</w:t>
-            </w:r>
-          </w:p>
-        </w:tc>
-        <w:tc>
-          <w:tcPr>
-            <w:tcW w:w="1800" w:type="dxa"/>
-            <w:tcMar>
-              <w:left w:w="90" w:type="dxa"/>
-              <w:right w:w="90" w:type="dxa"/>
-            </w:tcMar>
-          </w:tcPr>
-          <w:p>
-            <w:pPr>
-              <w:rPr>
-                <w:rFonts w:eastAsia="Arial"/>
-                <w:szCs w:val="21"/>
-              </w:rPr>
-            </w:pPr>
-            <w:r>
-              <w:rPr>
-                <w:rFonts w:eastAsia="Arial"/>
-                <w:b/>
-                <w:bCs/>
-                <w:szCs w:val="21"/>
-              </w:rPr>
-              <w:t xml:space="preserve">Answered by constraint, not yet by evidence</w:t>
-            </w:r>
-          </w:p>
-        </w:tc>
-        <w:tc>
-          <w:tcPr>
-            <w:tcW w:w="3525" w:type="dxa"/>
-            <w:tcBorders>
-              <w:right w:val="single" w:sz="6" w:space="0" w:color="auto"/>
-            </w:tcBorders>
-            <w:tcMar>
-              <w:left w:w="90" w:type="dxa"/>
-              <w:right w:w="90" w:type="dxa"/>
-            </w:tcMar>
-          </w:tcPr>
-          <w:p>
-            <w:pPr>
-              <w:rPr>
-                <w:rFonts w:eastAsia="Arial"/>
-                <w:szCs w:val="21"/>
-              </w:rPr>
-            </w:pPr>
-            <w:r>
-              <w:rPr>
-                <w:rFonts w:eastAsia="Arial"/>
-                <w:szCs w:val="21"/>
-              </w:rPr>
-              <w:t xml:space="preserve">Hard constraint of Table 2.1. Buoyancy-only circulation is the open check ranked first in Table 3.13.</w:t>
-            </w:r>
-          </w:p>
-        </w:tc>
-      </w:tr>
-    </w:tbl>
-    <w:p>
-      <w:pPr>
-        <w:spacing w:after="40"/>
-        <w:rPr>
-          <w:rFonts w:eastAsia="Arial" w:cs="Arial"/>
-          <w:color w:val="000000" w:themeColor="text1"/>
-          <w:szCs w:val="21"/>
-        </w:rPr>
-      </w:pPr>
+          <w:b/>
+          <w:bCs/>
+          <w:color w:val="000000" w:themeColor="text1"/>
+          <w:szCs w:val="21"/>
+        </w:rPr>
+        <w:t xml:space="preserve">A balance with one side.</w:t>
+      </w:r>
+      <w:r>
+        <w:rPr>
+          <w:rFonts w:eastAsia="Arial" w:cs="Arial"/>
+          <w:color w:val="000000" w:themeColor="text1"/>
+          <w:szCs w:val="21"/>
+        </w:rPr>
+        <w:t xml:space="preserve"> The added materials carry embodied emissions that no life cycle assessment has set against the avoided cooling load (Table 2.1).</w:t>
+      </w:r>
     </w:p>
     <w:p>
       <w:pPr>
-        <w:pStyle w:val="Beschriftung"/>
-        <w:rPr>
-          <w:rFonts w:eastAsia="Arial" w:cs="Arial"/>
-          <w:noProof w:val="0"/>
-          <w:color w:val="000000" w:themeColor="text1"/>
-        </w:rPr>
-      </w:pPr>
-      <w:r>
-        <w:rPr>
-          <w:rFonts w:eastAsia="Arial" w:cs="Arial"/>
-          <w:noProof w:val="0"/>
-          <w:color w:val="000000" w:themeColor="text1"/>
-        </w:rPr>
-        <w:t xml:space="preserve">Table 4.3 — The eight cycle design principles, with the status of each for Concept V2. Three are answered at least in principle, three are partly answered, and two lie outside the project.</w:t>
+        <w:pStyle w:val="berschrift3"/>
+        <w:rPr>
+          <w:rFonts w:eastAsia="Arial"/>
+        </w:rPr>
+      </w:pPr>
+      <w:r>
+        <w:rPr>
+          <w:rFonts w:eastAsia="Arial"/>
+        </w:rPr>
+        <w:t xml:space="preserve">Trade-offs</w:t>
       </w:r>
     </w:p>
     <w:p>
@@ -2822,41 +616,48 @@
       <w:r>
         <w:rPr>
           <w:rFonts w:eastAsia="Arial" w:cs="Arial"/>
-          <w:color w:val="000000" w:themeColor="text1"/>
-          <w:szCs w:val="21"/>
-        </w:rPr>
-        <w:t xml:space="preserve">Items 6 and 7 share a cause: both need somebody to own the material after its first life, which needs a business model — rental, service or deposit — rather than a sale. In a sales model the manufacturer transfers ownership, so the value created by durable, recoverable design accrues to the recycler, the user and the maintenance trade rather than to the party who paid for it. That split incentive is named as the principal obstacle to circular construction </w:t>
-      </w:r>
-      <w:r>
-        <w:rPr>
-          <w:rFonts w:eastAsia="Arial" w:cs="Arial"/>
-          <w:color w:val="000000" w:themeColor="text1"/>
-          <w:szCs w:val="21"/>
-          <w:highlight w:val="yellow"/>
-        </w:rPr>
-        <w:t xml:space="preserve">(Ellen MacArthur Foundation, 2015)</w:t>
-      </w:r>
-      <w:r>
-        <w:rPr>
-          <w:rFonts w:eastAsia="Arial" w:cs="Arial"/>
-          <w:color w:val="000000" w:themeColor="text1"/>
-          <w:szCs w:val="21"/>
-        </w:rPr>
-        <w:t xml:space="preserve">, and a façade retrofit has it in an acute form: the owner pays, the tenant gains comfort, the street gains the cooling, and nobody owns the outcome. Naming it is as far as this report goes. A service model in which cooling is delivered rather than panels sold would be the next step, and it lies outside the boundary of Section 2.3.</w:t>
+          <w:b/>
+          <w:bCs/>
+          <w:color w:val="000000" w:themeColor="text1"/>
+          <w:szCs w:val="21"/>
+        </w:rPr>
+        <w:t xml:space="preserve">Townscape.</w:t>
+      </w:r>
+      <w:r>
+        <w:rPr>
+          <w:rFonts w:eastAsia="Arial" w:cs="Arial"/>
+          <w:color w:val="000000" w:themeColor="text1"/>
+          <w:szCs w:val="21"/>
+        </w:rPr>
+        <w:t xml:space="preserve"> Ribs and panels change how the building looks; on a listed façade this collides with heritage protection [19, S. 148–151].</w:t>
       </w:r>
     </w:p>
     <w:p>
       <w:pPr>
-        <w:pStyle w:val="berschrift2"/>
-        <w:rPr>
-          <w:rFonts w:eastAsia="Arial"/>
-        </w:rPr>
-      </w:pPr>
-      <w:r>
-        <w:rPr>
-          <w:rFonts w:eastAsia="Arial"/>
-        </w:rPr>
-        <w:t xml:space="preserve">Environmental benefits, limitations and trade-offs</w:t>
+        <w:spacing w:after="40"/>
+        <w:rPr>
+          <w:rFonts w:eastAsia="Arial" w:cs="Arial"/>
+          <w:color w:val="000000" w:themeColor="text1"/>
+          <w:szCs w:val="21"/>
+        </w:rPr>
+      </w:pPr>
+      <w:r>
+        <w:rPr>
+          <w:rFonts w:eastAsia="Arial" w:cs="Arial"/>
+          <w:b/>
+          <w:bCs/>
+          <w:color w:val="000000" w:themeColor="text1"/>
+          <w:szCs w:val="21"/>
+        </w:rPr>
+        <w:t xml:space="preserve">Winter heating.</w:t>
+      </w:r>
+      <w:r>
+        <w:rPr>
+          <w:rFonts w:eastAsia="Arial" w:cs="Arial"/>
+          <w:color w:val="000000" w:themeColor="text1"/>
+          <w:szCs w:val="21"/>
+        </w:rPr>
+        <w:t xml:space="preserve"> What shades and reflects in summer also rejects winter sun and can raise heating demand and its emissions [23]; the net annual effect is unknown.</w:t>
       </w:r>
     </w:p>
     <w:p>
@@ -2876,15 +677,15 @@
           <w:color w:val="000000" w:themeColor="text1"/>
           <w:szCs w:val="21"/>
         </w:rPr>
-        <w:t xml:space="preserve">What the concept avoids.</w:t>
-      </w:r>
-      <w:r>
-        <w:rPr>
-          <w:rFonts w:eastAsia="Arial" w:cs="Arial"/>
-          <w:color w:val="000000" w:themeColor="text1"/>
-          <w:szCs w:val="21"/>
-        </w:rPr>
-        <w:t xml:space="preserve"> The benefit V2 can claim is defined by what it does not do. It uses no electricity for cooling, so it does not add to the feedback loop of Section 2.1, in which cooling demand raises emissions and heat rejection. It rejects heat at roof level, not into the street canyon at head height as an air-conditioning condenser does. And it retains the existing wall and roof, which for a retrofit is the largest material saving available. None of these is a measured benefit: no surface-temperature reduction has been calculated (Section 3.3.1), and the load figures of Sections 3.2.7 to 3.3.5 are assumptions.</w:t>
+        <w:t xml:space="preserve">Roof area.</w:t>
+      </w:r>
+      <w:r>
+        <w:rPr>
+          <w:rFonts w:eastAsia="Arial" w:cs="Arial"/>
+          <w:color w:val="000000" w:themeColor="text1"/>
+          <w:szCs w:val="21"/>
+        </w:rPr>
+        <w:t xml:space="preserve"> Every square metre that releases heat is a square metre without photovoltaic yield (Figure 3.4).</w:t>
       </w:r>
     </w:p>
     <w:p>
@@ -2904,15 +705,15 @@
           <w:color w:val="000000" w:themeColor="text1"/>
           <w:szCs w:val="21"/>
         </w:rPr>
-        <w:t xml:space="preserve">Removal against redistribution.</w:t>
-      </w:r>
-      <w:r>
-        <w:rPr>
-          <w:rFonts w:eastAsia="Arial" w:cs="Arial"/>
-          <w:color w:val="000000" w:themeColor="text1"/>
-          <w:szCs w:val="21"/>
-        </w:rPr>
-        <w:t xml:space="preserve"> Whether the concept removes heat from the city or only moves it depends on the path, and V2 uses both. The radiative term of Engineering Check 2 — about 83 W/m² for the assumed 35 °C roof and 20 °C sky — leaves the system; the convective term of 15–40 W/m² warms the roof air and stays in the urban boundary layer. Under those assumptions, between two-thirds and five-sixths of the gross release is genuine removal. Under a warmer 30 °C sky the radiative term falls to about 29 W/m² and the net release to 4–29 W/m² (Table 3.9): on a humid, hazy night — the conditions of a heat wave — the concept is largely redistributing. A reduction is therefore claimed only for the radiative share.</w:t>
+        <w:t xml:space="preserve">Additive or downtime.</w:t>
+      </w:r>
+      <w:r>
+        <w:rPr>
+          <w:rFonts w:eastAsia="Arial" w:cs="Arial"/>
+          <w:color w:val="000000" w:themeColor="text1"/>
+          <w:szCs w:val="21"/>
+        </w:rPr>
+        <w:t xml:space="preserve"> Avoiding antifreeze costs the shoulder seasons and admits air that may bring back a corrosion inhibitor (Section 3.3.5).</w:t>
       </w:r>
     </w:p>
     <w:p>
@@ -2932,15 +733,15 @@
           <w:color w:val="000000" w:themeColor="text1"/>
           <w:szCs w:val="21"/>
         </w:rPr>
-        <w:t xml:space="preserve">Frost protection against life-friendly chemistry.</w:t>
-      </w:r>
-      <w:r>
-        <w:rPr>
-          <w:rFonts w:eastAsia="Arial" w:cs="Arial"/>
-          <w:color w:val="000000" w:themeColor="text1"/>
-          <w:szCs w:val="21"/>
-        </w:rPr>
-        <w:t xml:space="preserve"> The loop must survive frost to about −10 °C. Glycol would put a mobile additive inside a pipe running the full height of an occupied façade, where the failure mode is a leak into the wall or the ground; V2 drains instead (Section 3.3.5). The cost is real: the system is out of service in the shoulder seasons, drainback needs sloping pipes of about 2.1 % and air entry [18], trapped water and pump-assisted refill remain open, and a loop that admits air on every cycle invites corrosion — and with it the inhibitor that the drainback was meant to avoid. The trade-off is decided in favour of the principle, and its price is carried by operation.</w:t>
+        <w:t xml:space="preserve">Access or invisibility.</w:t>
+      </w:r>
+      <w:r>
+        <w:rPr>
+          <w:rFonts w:eastAsia="Arial" w:cs="Arial"/>
+          <w:color w:val="000000" w:themeColor="text1"/>
+          <w:szCs w:val="21"/>
+        </w:rPr>
+        <w:t xml:space="preserve"> Repairable external pipes are the same visible layer that alters the façade.</w:t>
       </w:r>
     </w:p>
     <w:p>
@@ -2955,20 +756,70 @@
       <w:r>
         <w:rPr>
           <w:rFonts w:eastAsia="Arial" w:cs="Arial"/>
+          <w:color w:val="000000" w:themeColor="text1"/>
+          <w:szCs w:val="21"/>
+        </w:rPr>
+        <w:t xml:space="preserve">Under a clear summer sky V2 exports heat from the city at no running cost; the rest of the year it is a visible layer on a listed façade that yields nothing.</w:t>
+      </w:r>
+    </w:p>
+    <w:p>
+      <w:pPr>
+        <w:pStyle w:val="berschrift2"/>
+        <w:rPr>
+          <w:rFonts w:eastAsia="Arial"/>
+        </w:rPr>
+      </w:pPr>
+      <w:r>
+        <w:rPr>
+          <w:rFonts w:eastAsia="Arial"/>
+        </w:rPr>
+        <w:t xml:space="preserve">Materials, durability, repair and circularity</w:t>
+      </w:r>
+    </w:p>
+    <w:p>
+      <w:pPr>
+        <w:spacing w:after="40"/>
+        <w:rPr>
+          <w:rFonts w:eastAsia="Arial" w:cs="Arial"/>
+          <w:color w:val="000000" w:themeColor="text1"/>
+          <w:szCs w:val="21"/>
+        </w:rPr>
+      </w:pPr>
+      <w:r>
+        <w:rPr>
+          <w:rFonts w:eastAsia="Arial" w:cs="Arial"/>
+          <w:color w:val="000000" w:themeColor="text1"/>
+          <w:szCs w:val="21"/>
+        </w:rPr>
+        <w:t xml:space="preserve">Cradle to Cradle separates biological nutrients, which are consumed and must return safely to the environment, from technical nutrients, which are used without wear and recovered [25]. The rule that assigns a layer to a cycle is wear: what is worn out must be able to enter the biological cycle, what is only used can stay in the technical one [26]. Applied layer by layer to the build-up of Figure 3.5, it gives the following picture of what V2 has decided and what is still open.</w:t>
+      </w:r>
+    </w:p>
+    <w:p>
+      <w:pPr>
+        <w:spacing w:after="40"/>
+        <w:rPr>
+          <w:rFonts w:eastAsia="Arial" w:cs="Arial"/>
+          <w:color w:val="000000" w:themeColor="text1"/>
+          <w:szCs w:val="21"/>
+        </w:rPr>
+      </w:pPr>
+      <w:r>
+        <w:rPr>
+          <w:rFonts w:eastAsia="Arial" w:cs="Arial"/>
           <w:b/>
           <w:bCs/>
           <w:color w:val="000000" w:themeColor="text1"/>
           <w:szCs w:val="21"/>
         </w:rPr>
-        <w:t xml:space="preserve">Summer against winter.</w:t>
-      </w:r>
-      <w:r>
-        <w:rPr>
-          <w:rFonts w:eastAsia="Arial" w:cs="Arial"/>
-          <w:color w:val="000000" w:themeColor="text1"/>
-          <w:szCs w:val="21"/>
-        </w:rPr>
-        <w:t xml:space="preserve"> The ribs and the reflective roof reduce summer gain and also reduce useful winter solar gains; reflective roofs may increase heating demand [17]. The Winter constraint of Table 2.1 requires that this be quantified, and it has not been: the annual balance for the Swiss climate is part of item 5 of Table 3.13. Until that number exists this is a known, unquantified risk, not a solved trade-off. Rib spacing is the one lever that can serve both seasons (Section 3.3.4).</w:t>
+        <w:t xml:space="preserve">Timber ribs.</w:t>
+      </w:r>
+      <w:r>
+        <w:rPr>
+          <w:rFonts w:eastAsia="Arial" w:cs="Arial"/>
+          <w:color w:val="000000" w:themeColor="text1"/>
+          <w:szCs w:val="21"/>
+        </w:rPr>
+        <w:t xml:space="preserve"> Worn by UV, driving rain and freeze–thaw, so they belong to the biological cycle: what weathers off lands on the pavement, and the timber must be untreated, naturally durable, or protected by detailing rather than by chemistry. Species and treatment are open (Section 3.3.4).</w:t>
       </w:r>
     </w:p>
     <w:p>
@@ -2988,15 +839,15 @@
           <w:color w:val="000000" w:themeColor="text1"/>
           <w:szCs w:val="21"/>
         </w:rPr>
-        <w:t xml:space="preserve">Cooling area against photovoltaics.</w:t>
-      </w:r>
-      <w:r>
-        <w:rPr>
-          <w:rFonts w:eastAsia="Arial" w:cs="Arial"/>
-          <w:color w:val="000000" w:themeColor="text1"/>
-          <w:szCs w:val="21"/>
-        </w:rPr>
-        <w:t xml:space="preserve"> The cooling strips share the roof with solar panels and rooflights (Figure 3.4): every square metre of emitter is a square metre not generating electricity. The Solar energy constraint of Table 2.1 is soft, so V2 does not fail it, but the 740 m² allocated to cooling is a choice against photovoltaic yield that a full assessment would have to price.</w:t>
+        <w:t xml:space="preserve">Collector panels and finish.</w:t>
+      </w:r>
+      <w:r>
+        <w:rPr>
+          <w:rFonts w:eastAsia="Arial" w:cs="Arial"/>
+          <w:color w:val="000000" w:themeColor="text1"/>
+          <w:szCs w:val="21"/>
+        </w:rPr>
+        <w:t xml:space="preserve"> Slow surface wear, otherwise used as structure: technical cycle, if the panel is one recoverable material with a benign finish. The panels are designed to be removed (Figure 3.8); their fixings are not detailed.</w:t>
       </w:r>
     </w:p>
     <w:p>
@@ -3016,15 +867,15 @@
           <w:color w:val="000000" w:themeColor="text1"/>
           <w:szCs w:val="21"/>
         </w:rPr>
-        <w:t xml:space="preserve">Materials and embodied emissions.</w:t>
-      </w:r>
-      <w:r>
-        <w:rPr>
-          <w:rFonts w:eastAsia="Arial" w:cs="Arial"/>
-          <w:color w:val="000000" w:themeColor="text1"/>
-          <w:szCs w:val="21"/>
-        </w:rPr>
-        <w:t xml:space="preserve"> The added build-up — pipework, carrier plate, panels, ribs, supports and 5.8 m³ of water on the roof — has not been counted. The Embodied emissions constraint of Table 2.1 asks that the greenhouse gas embodied in it be repaid by avoided cooling demand within the service life; without a life cycle assessment and without a demonstrated cooling benefit, neither side of that comparison exists. The water alone adds about 5.8 t to the roof, excluding pipes and plate, which is a structural check as well (Section 3.3.5).</w:t>
+        <w:t xml:space="preserve">Roof coating.</w:t>
+      </w:r>
+      <w:r>
+        <w:rPr>
+          <w:rFonts w:eastAsia="Arial" w:cs="Arial"/>
+          <w:color w:val="000000" w:themeColor="text1"/>
+          <w:szCs w:val="21"/>
+        </w:rPr>
+        <w:t xml:space="preserve"> Worn by UV, rain, soiling and cleaning, and abraded into run-off that reaches the stormwater network of Section 2.3, so it must break down harmlessly. It also carries the assumed reflectance 0.95 and emittance 0.90 (Section 3.2.8). The pigment has been checked (below); binder and preservatives have not.</w:t>
       </w:r>
     </w:p>
     <w:p>
@@ -3044,29 +895,43 @@
           <w:color w:val="000000" w:themeColor="text1"/>
           <w:szCs w:val="21"/>
         </w:rPr>
-        <w:t xml:space="preserve">People and townscape.</w:t>
-      </w:r>
-      <w:r>
-        <w:rPr>
-          <w:rFonts w:eastAsia="Arial" w:cs="Arial"/>
-          <w:color w:val="000000" w:themeColor="text1"/>
-          <w:szCs w:val="21"/>
-        </w:rPr>
-        <w:t xml:space="preserve"> V2 cut the ribs back to start about 3.4 m above ground and thinned the base to 0.20 m to keep pavement width (Section 3.3.4). The conflict with heritage protection remains [13]: a visible timber-and-panel layer on a listed façade may not be acceptable, and the concept has no answer beyond retaining the wall and demonstrating the cooling benefit.</w:t>
+        <w:t xml:space="preserve">Pipework, carrier plate, supports and fixings.</w:t>
+      </w:r>
+      <w:r>
+        <w:rPr>
+          <w:rFonts w:eastAsia="Arial" w:cs="Arial"/>
+          <w:color w:val="000000" w:themeColor="text1"/>
+          <w:szCs w:val="21"/>
+        </w:rPr>
+        <w:t xml:space="preserve"> Used, not consumed: technical cycle, recoverable if specified as separable single materials. At about 4,620 m of roof pipe this is the largest mass in the build-up. The roof pipes under the plate cannot be reached for repair the way the façade pipes can.</w:t>
       </w:r>
     </w:p>
     <w:p>
       <w:pPr>
-        <w:pStyle w:val="berschrift2"/>
-        <w:rPr>
-          <w:rFonts w:eastAsia="Arial"/>
-        </w:rPr>
-      </w:pPr>
-      <w:r>
-        <w:rPr>
-          <w:rFonts w:eastAsia="Arial"/>
-        </w:rPr>
-        <w:t xml:space="preserve">Circular does not mean sustainable</w:t>
+        <w:spacing w:after="40"/>
+        <w:rPr>
+          <w:rFonts w:eastAsia="Arial" w:cs="Arial"/>
+          <w:color w:val="000000" w:themeColor="text1"/>
+          <w:szCs w:val="21"/>
+        </w:rPr>
+      </w:pPr>
+      <w:r>
+        <w:rPr>
+          <w:rFonts w:eastAsia="Arial" w:cs="Arial"/>
+          <w:b/>
+          <w:bCs/>
+          <w:color w:val="000000" w:themeColor="text1"/>
+          <w:szCs w:val="21"/>
+        </w:rPr>
+        <w:t xml:space="preserve">Water in the loop.</w:t>
+      </w:r>
+      <w:r>
+        <w:rPr>
+          <w:rFonts w:eastAsia="Arial" w:cs="Arial"/>
+          <w:color w:val="000000" w:themeColor="text1"/>
+          <w:szCs w:val="21"/>
+        </w:rPr>
+        <w:t xml:space="preserve"> Used, but mobile, and in neither cycle cleanly: about 5.8 m³ is drained to storage each winter and eventually disposed of, and with an inhibitor it is the one component that can leave the system by accident.</w:t>
       </w:r>
     </w:p>
     <w:p>
@@ -3081,10 +946,20 @@
       <w:r>
         <w:rPr>
           <w:rFonts w:eastAsia="Arial" w:cs="Arial"/>
-          <w:color w:val="000000" w:themeColor="text1"/>
-          <w:szCs w:val="21"/>
-        </w:rPr>
-        <w:t xml:space="preserve">Keeping a material in circulation is not by itself an environmental benefit. The standard counter-example is an additive that is harmless in its first application, in a laptop housing, and hazardous in its second after recycling into a children’s toy: the substance did not change, the exposure pathway did.</w:t>
+          <w:b/>
+          <w:bCs/>
+          <w:color w:val="000000" w:themeColor="text1"/>
+          <w:szCs w:val="21"/>
+        </w:rPr>
+        <w:t xml:space="preserve">Existing wall and roof.</w:t>
+      </w:r>
+      <w:r>
+        <w:rPr>
+          <w:rFonts w:eastAsia="Arial" w:cs="Arial"/>
+          <w:color w:val="000000" w:themeColor="text1"/>
+          <w:szCs w:val="21"/>
+        </w:rPr>
+        <w:t xml:space="preserve"> Untouched and outside the product. Retaining them is the largest material saving of V2 against a new build.</w:t>
       </w:r>
     </w:p>
     <w:p>
@@ -3102,7 +977,7 @@
           <w:color w:val="000000" w:themeColor="text1"/>
           <w:szCs w:val="21"/>
         </w:rPr>
-        <w:t xml:space="preserve">V2 has the same failure mode, and it is the reason the life-friendly-chemistry principle is not decorative here. A substance that is acceptable in a roof coating or a timber treatment becomes a different question once it leaves the layer, and in this concept every wearing layer has a defined exit: the roof coating into run-off that reaches the stormwater network of Section 2.3, the timber treatment onto the pavement below the ribs, an inhibitor into the wall or the ground on a leak. The substance would not change; the exposure pathway would.</w:t>
+        <w:t xml:space="preserve">Measured against the eight cycle design principles of the lecture [26], V2 answers three in principle and none with evidence. Modular construction (3) and reparability (5) follow from moving the pipes out of the wall: a panel can be removed and the façade pipes inspected without opening the wall (Sections 3.3.2 to 3.3.4), but the roof pipes cannot. Efficient use of energy (8) is a hard constraint of Table 2.1 and an open check, not a result. Durability (4) is defined by KPI 6 but has neither a target nor ageing data (Table 3.10). Ecotoxic chemicals (1) and recyclable materials (2) are partly answered, as the layer assessment above shows. Cascade use (6) and return logistics (7) are not addressed: both need an owner of the material after its first life, which is a business model, and Table 2.2 confines the project to the façade and roof.</w:t>
       </w:r>
     </w:p>
     <w:p>
@@ -3117,10 +992,20 @@
       <w:r>
         <w:rPr>
           <w:rFonts w:eastAsia="Arial" w:cs="Arial"/>
-          <w:color w:val="000000" w:themeColor="text1"/>
-          <w:szCs w:val="21"/>
-        </w:rPr>
-        <w:t xml:space="preserve">Two consequences follow. Durability should be reached by detailing and material choice before chemistry — a naturally durable timber species or constructional protection for the ribs, an abrasion-resistant film rather than a biocidal one for the roof — and any substance that does remain in the specification must be checked rather than assumed.</w:t>
+          <w:b/>
+          <w:bCs/>
+          <w:color w:val="000000" w:themeColor="text1"/>
+          <w:szCs w:val="21"/>
+        </w:rPr>
+        <w:t xml:space="preserve">Circular is not the same as harmless.</w:t>
+      </w:r>
+      <w:r>
+        <w:rPr>
+          <w:rFonts w:eastAsia="Arial" w:cs="Arial"/>
+          <w:color w:val="000000" w:themeColor="text1"/>
+          <w:szCs w:val="21"/>
+        </w:rPr>
+        <w:t xml:space="preserve"> Keeping a material in circulation is not by itself a benefit: an additive that is harmless in a laptop housing can be hazardous after recycling into a toy, because the exposure pathway changes while the substance does not [26]. V2 has the same failure mode, and every wearing layer has a defined exit: the coating into run-off, the timber treatment onto the pavement, an inhibitor into the wall or the ground on a leak. Durability should therefore come from detailing and material choice before chemistry, and any substance that remains must be checked rather than assumed.</w:t>
       </w:r>
     </w:p>
     <w:p>
@@ -3148,41 +1033,7 @@
           <w:color w:val="000000" w:themeColor="text1"/>
           <w:szCs w:val="21"/>
         </w:rPr>
-        <w:t xml:space="preserve"> The pigment that gives conventional white cool-roof coatings their reflectance is titanium dioxide, so it was checked in the REACH registry of the European Chemicals Agency </w:t>
-      </w:r>
-      <w:r>
-        <w:rPr>
-          <w:rFonts w:eastAsia="Arial" w:cs="Arial"/>
-          <w:color w:val="000000" w:themeColor="text1"/>
-          <w:szCs w:val="21"/>
-          <w:highlight w:val="yellow"/>
-        </w:rPr>
-        <w:t xml:space="preserve">(European Chemicals Agency, n.d.)</w:t>
-      </w:r>
-      <w:r>
-        <w:rPr>
-          <w:rFonts w:eastAsia="Arial" w:cs="Arial"/>
-          <w:color w:val="000000" w:themeColor="text1"/>
-          <w:szCs w:val="21"/>
-        </w:rPr>
-        <w:t xml:space="preserve">. Powdered titanium dioxide with at least 1 % of particles of 10 µm or smaller was classified in 2020 as a suspected carcinogen by inhalation (Regulation (EU) 2020/217, hazard statement H351). The General Court annulled that classification in 2022 and the Court of Justice confirmed the annulment on 1 August 2025 </w:t>
-      </w:r>
-      <w:r>
-        <w:rPr>
-          <w:rFonts w:eastAsia="Arial" w:cs="Arial"/>
-          <w:color w:val="000000" w:themeColor="text1"/>
-          <w:szCs w:val="21"/>
-          <w:highlight w:val="yellow"/>
-        </w:rPr>
-        <w:t xml:space="preserve">(Court of Justice of the European Union, 2025)</w:t>
-      </w:r>
-      <w:r>
-        <w:rPr>
-          <w:rFonts w:eastAsia="Arial" w:cs="Arial"/>
-          <w:color w:val="000000" w:themeColor="text1"/>
-          <w:szCs w:val="21"/>
-        </w:rPr>
-        <w:t xml:space="preserve">, so the pigment currently carries no harmonised hazard classification. Two qualifications keep this from being a clean result. The concern was inhalation of dust — a manufacturing and abrasion pathway, not the applied film — and the ruling turned on the reliability of one study, not on a finding of safety. And the pigment is not the coating: the binder and the film preservatives that exterior paints commonly contain are the substances that reach the run-off, and they have not been checked. The timber treatment and any inhibitor remain unchecked as well. The check is therefore one substance of at least four, and the remaining three belong to item 5 of Table 3.13.</w:t>
+        <w:t xml:space="preserve"> White cool-roof coatings owe their reflectance to titanium dioxide, so it was checked in the REACH database of the European Chemicals Agency [27]. The powder form was classified in 2020 as a suspected carcinogen by inhalation (Regulation (EU) 2020/217, H351); the General Court annulled the classification in 2022 and the Court of Justice confirmed the annulment on 1 August 2025 [28], so the pigment currently carries no harmonized hazard classification. The result is not clean: the concern was dust inhalation, not the applied film, and the ruling turned on the reliability of one study, not on a finding of safety. The pigment is also not the coating: the binder and the film preservatives are what reach the run-off, and they, the timber treatment and any inhibitor remain unchecked. One substance of at least four has been checked; the other three belong to item 5 of Table 3.13.</w:t>
       </w:r>
     </w:p>
     <w:p>
@@ -3214,7 +1065,7 @@
           <w:color w:val="000000" w:themeColor="text1"/>
           <w:szCs w:val="21"/>
         </w:rPr>
-        <w:t xml:space="preserve">The template asks this directly, and it is the question a sustainability section most easily fails, because the honest answer is often no. Here it is yes, in four instances that are documented in Sections 3.2 and 3.3 rather than asserted here.</w:t>
+        <w:t xml:space="preserve">Yes, in four instances that are documented in Sections 3.2 and 3.3 rather than asserted here.</w:t>
       </w:r>
     </w:p>
     <w:p>
@@ -3229,28 +1080,20 @@
       <w:r>
         <w:rPr>
           <w:rFonts w:eastAsia="Arial" w:cs="Arial"/>
-          <w:color w:val="000000" w:themeColor="text1"/>
-          <w:szCs w:val="21"/>
-        </w:rPr>
-        <w:t xml:space="preserve">1. </w:t>
-      </w:r>
-      <w:r>
-        <w:rPr>
-          <w:rFonts w:eastAsia="Arial" w:cs="Arial"/>
           <w:b/>
           <w:bCs/>
           <w:color w:val="000000" w:themeColor="text1"/>
           <w:szCs w:val="21"/>
         </w:rPr>
-        <w:t xml:space="preserve">The reflective surface was moved from the façade to the roof.</w:t>
-      </w:r>
-      <w:r>
-        <w:rPr>
-          <w:rFonts w:eastAsia="Arial" w:cs="Arial"/>
-          <w:color w:val="000000" w:themeColor="text1"/>
-          <w:szCs w:val="21"/>
-        </w:rPr>
-        <w:t xml:space="preserve"> Concept C placed the reflective surface on the façade. It was set aside in Section 3.2.2 because reflective walls increased pedestrian heat stress in simulations of a Stuttgart street canyon [9], and Concept A therefore reflects on the roof. A concept was changed by the principle be locally attuned and responsive, applied to the people at street level rather than to the building.</w:t>
+        <w:t xml:space="preserve">1. The reflective surface moved from the façade to the roof.</w:t>
+      </w:r>
+      <w:r>
+        <w:rPr>
+          <w:rFonts w:eastAsia="Arial" w:cs="Arial"/>
+          <w:color w:val="000000" w:themeColor="text1"/>
+          <w:szCs w:val="21"/>
+        </w:rPr>
+        <w:t xml:space="preserve"> Concept C reflected on the façade and was set aside because reflective walls raised pedestrian heat stress in simulations of a Stuttgart street canyon [15]; Concept A reflects on the roof instead (Section 3.2.2). The change was made for the people at street level, not for cooling performance.</w:t>
       </w:r>
     </w:p>
     <w:p>
@@ -3265,28 +1108,20 @@
       <w:r>
         <w:rPr>
           <w:rFonts w:eastAsia="Arial" w:cs="Arial"/>
-          <w:color w:val="000000" w:themeColor="text1"/>
-          <w:szCs w:val="21"/>
-        </w:rPr>
-        <w:t xml:space="preserve">2. </w:t>
-      </w:r>
-      <w:r>
-        <w:rPr>
-          <w:rFonts w:eastAsia="Arial" w:cs="Arial"/>
           <w:b/>
           <w:bCs/>
           <w:color w:val="000000" w:themeColor="text1"/>
           <w:szCs w:val="21"/>
         </w:rPr>
-        <w:t xml:space="preserve">Water and power demand removed two options before any concept was drawn.</w:t>
-      </w:r>
-      <w:r>
-        <w:rPr>
-          <w:rFonts w:eastAsia="Arial" w:cs="Arial"/>
-          <w:color w:val="000000" w:themeColor="text1"/>
-          <w:szCs w:val="21"/>
-        </w:rPr>
-        <w:t xml:space="preserve"> The evaporating wet layer and the fan-driven cavity of Table 3.5 were not developed further because of their water and power demand (Section 3.2.2). The hard constraints Energy and Water of Table 2.1 — be resource efficient written as constraints — decided this, not cooling performance.</w:t>
+        <w:t xml:space="preserve">2. Water and power demand removed two options before any concept was drawn.</w:t>
+      </w:r>
+      <w:r>
+        <w:rPr>
+          <w:rFonts w:eastAsia="Arial" w:cs="Arial"/>
+          <w:color w:val="000000" w:themeColor="text1"/>
+          <w:szCs w:val="21"/>
+        </w:rPr>
+        <w:t xml:space="preserve"> The evaporating wet layer and the fan-driven cavity of Table 3.5 were not developed further because of their water and power demand (Section 3.2.2). The Energy and Water constraints of Table 2.1, which are be resource efficient written as constraints, decided this.</w:t>
       </w:r>
     </w:p>
     <w:p>
@@ -3301,28 +1136,20 @@
       <w:r>
         <w:rPr>
           <w:rFonts w:eastAsia="Arial" w:cs="Arial"/>
-          <w:color w:val="000000" w:themeColor="text1"/>
-          <w:szCs w:val="21"/>
-        </w:rPr>
-        <w:t xml:space="preserve">3. </w:t>
-      </w:r>
-      <w:r>
-        <w:rPr>
-          <w:rFonts w:eastAsia="Arial" w:cs="Arial"/>
           <w:b/>
           <w:bCs/>
           <w:color w:val="000000" w:themeColor="text1"/>
           <w:szCs w:val="21"/>
         </w:rPr>
-        <w:t xml:space="preserve">The pipes were moved out of the wall.</w:t>
-      </w:r>
-      <w:r>
-        <w:rPr>
-          <w:rFonts w:eastAsia="Arial" w:cs="Arial"/>
-          <w:color w:val="000000" w:themeColor="text1"/>
-          <w:szCs w:val="21"/>
-        </w:rPr>
-        <w:t xml:space="preserve"> V1 embedded the pipes in the façade. The engineering review (Table 3.11) judged hidden damage and the lack of access unacceptable, and V2 placed the pipes in separable external panels with a drainage gap behind them (Section 3.3.3). This is cycle design principles 3 and 5 — dismantle and repair — changing the construction, and it also opened the concept to existing buildings, which the soft constraint in Table 2.1 prefers.</w:t>
+        <w:t xml:space="preserve">3. The pipes moved out of the wall.</w:t>
+      </w:r>
+      <w:r>
+        <w:rPr>
+          <w:rFonts w:eastAsia="Arial" w:cs="Arial"/>
+          <w:color w:val="000000" w:themeColor="text1"/>
+          <w:szCs w:val="21"/>
+        </w:rPr>
+        <w:t xml:space="preserve"> V1 embedded them in the façade; the engineering review judged hidden damage and the lack of access unacceptable (Table 3.11), and V2 placed them in separable external panels with a drainage gap behind them (Section 3.3.3). Dismantling and repair changed the construction, and the change also opened the concept to existing buildings.</w:t>
       </w:r>
     </w:p>
     <w:p>
@@ -3337,28 +1164,20 @@
       <w:r>
         <w:rPr>
           <w:rFonts w:eastAsia="Arial" w:cs="Arial"/>
-          <w:color w:val="000000" w:themeColor="text1"/>
-          <w:szCs w:val="21"/>
-        </w:rPr>
-        <w:t xml:space="preserve">4. </w:t>
-      </w:r>
-      <w:r>
-        <w:rPr>
-          <w:rFonts w:eastAsia="Arial" w:cs="Arial"/>
           <w:b/>
           <w:bCs/>
           <w:color w:val="000000" w:themeColor="text1"/>
           <w:szCs w:val="21"/>
         </w:rPr>
-        <w:t xml:space="preserve">Water instead of glycol.</w:t>
-      </w:r>
-      <w:r>
-        <w:rPr>
-          <w:rFonts w:eastAsia="Arial" w:cs="Arial"/>
-          <w:color w:val="000000" w:themeColor="text1"/>
-          <w:szCs w:val="21"/>
-        </w:rPr>
-        <w:t xml:space="preserve"> Frost protection was decided by drainback rather than by an additive (Section 3.3.5). The principle use life-friendly chemistry cost the concept its shoulder-season operation; the trade was made knowingly.</w:t>
+        <w:t xml:space="preserve">4. Water instead of glycol.</w:t>
+      </w:r>
+      <w:r>
+        <w:rPr>
+          <w:rFonts w:eastAsia="Arial" w:cs="Arial"/>
+          <w:color w:val="000000" w:themeColor="text1"/>
+          <w:szCs w:val="21"/>
+        </w:rPr>
+        <w:t xml:space="preserve"> Frost protection was decided by drainback rather than by an additive (Section 3.3.5). Use life-friendly chemistry cost the concept its shoulder-season operation, and the trade was made knowingly.</w:t>
       </w:r>
     </w:p>
     <w:p>
@@ -3376,7 +1195,7 @@
           <w:color w:val="000000" w:themeColor="text1"/>
           <w:szCs w:val="21"/>
         </w:rPr>
-        <w:t xml:space="preserve">Two considerations did not change the design and should be named as such. The winter balance and the embodied emissions of the build-up are both constraints in Table 2.1, and both remain unquantified; they have shaped what this report refuses to claim, not what the concept is.</w:t>
+        <w:t xml:space="preserve">Two considerations did not change the design and should be named as such: the winter balance and the embodied emissions of the build-up are constraints in Table 2.1 that remain unquantified. They have shaped what this report refuses to claim, not what the concept is.</w:t>
       </w:r>
     </w:p>
     <w:p>
@@ -3408,11 +1227,25 @@
           <w:color w:val="000000" w:themeColor="text1"/>
           <w:szCs w:val="21"/>
         </w:rPr>
-        <w:t xml:space="preserve">No life cycle assessment was performed, so no statement in this section should be read as a quantified environmental balance. The assessment is made against Concept V2 as described in Section 3.3, whose central claim — that buoyancy alone circulates the water — is the first-ranked open check of Table 3.13; if it fails and a pump is needed, the Energy constraint and the resource-efficiency row of Table 4.1 fall with it. Durability is defined by KPI 6 but has no data. Of the eight cycle design principles, cascade use and return logistics are not addressed, and the reason is a boundary decision rather than an analysis: they require a business model, and this project does not design one. Finally, of the substances the concept would put into the street, one has been checked and three have not.</w:t>
+        <w:t xml:space="preserve">No life cycle assessment was performed, so nothing in this section is a quantified environmental balance. The assessment is made against Concept V2 as described in Section 3.3, whose central claim of buoyancy-only circulation is the first-ranked open check of Table 3.13; if a pump is needed, the Energy constraint and the resource-efficiency assessment of Section 4.1 fall with it. Durability is defined by KPI 6 but has no data, cascade use and return logistics lie outside the project boundary, and of the substances the concept would put into the street one has been checked and three have not.</w:t>
       </w:r>
     </w:p>
     <w:p>
       <w:pPr>
+        <w:pStyle w:val="berschrift2"/>
+        <w:rPr>
+          <w:rFonts w:eastAsia="Arial"/>
+        </w:rPr>
+      </w:pPr>
+      <w:r>
+        <w:rPr>
+          <w:rFonts w:eastAsia="Arial"/>
+        </w:rPr>
+        <w:t xml:space="preserve">References added by this section (to be entered in Zotero)</w:t>
+      </w:r>
+    </w:p>
+    <w:p>
+      <w:pPr>
         <w:spacing w:after="40"/>
         <w:rPr>
           <w:rFonts w:eastAsia="Arial" w:cs="Arial"/>
@@ -3420,6 +1253,68 @@
           <w:szCs w:val="21"/>
         </w:rPr>
       </w:pPr>
+      <w:r>
+        <w:rPr>
+          <w:rFonts w:eastAsia="Arial" w:cs="Arial"/>
+          <w:color w:val="000000" w:themeColor="text1"/>
+          <w:szCs w:val="21"/>
+        </w:rPr>
+        <w:t xml:space="preserve">[25] M. Braungart und W. McDonough, Cradle to Cradle: Remaking the Way We Make Things. New York: North Point Press, 2002.</w:t>
+      </w:r>
+    </w:p>
+    <w:p>
+      <w:pPr>
+        <w:spacing w:after="40"/>
+        <w:rPr>
+          <w:rFonts w:eastAsia="Arial" w:cs="Arial"/>
+          <w:color w:val="000000" w:themeColor="text1"/>
+          <w:szCs w:val="21"/>
+        </w:rPr>
+      </w:pPr>
+      <w:r>
+        <w:rPr>
+          <w:rFonts w:eastAsia="Arial" w:cs="Arial"/>
+          <w:color w:val="000000" w:themeColor="text1"/>
+          <w:szCs w:val="21"/>
+        </w:rPr>
+        <w:t xml:space="preserve">[26] ZHAW Blockweek Bionics 2026, «Cradle to Cradle», Vorlesungsfolien (38 Folien), Zürcher Hochschule für Angewandte Wissenschaften, 2026.</w:t>
+      </w:r>
+    </w:p>
+    <w:p>
+      <w:pPr>
+        <w:spacing w:after="40"/>
+        <w:rPr>
+          <w:rFonts w:eastAsia="Arial" w:cs="Arial"/>
+          <w:color w:val="000000" w:themeColor="text1"/>
+          <w:szCs w:val="21"/>
+        </w:rPr>
+      </w:pPr>
+      <w:r>
+        <w:rPr>
+          <w:rFonts w:eastAsia="Arial" w:cs="Arial"/>
+          <w:color w:val="000000" w:themeColor="text1"/>
+          <w:szCs w:val="21"/>
+        </w:rPr>
+        <w:t xml:space="preserve">[27] European Chemicals Agency, «REACH registered substances database». Zugegriffen: 3. September 2026. [Online]. Verfügbar unter: https://chem.echa.europa.eu/</w:t>
+      </w:r>
+    </w:p>
+    <w:p>
+      <w:pPr>
+        <w:spacing w:after="40"/>
+        <w:rPr>
+          <w:rFonts w:eastAsia="Arial" w:cs="Arial"/>
+          <w:color w:val="000000" w:themeColor="text1"/>
+          <w:szCs w:val="21"/>
+        </w:rPr>
+      </w:pPr>
+      <w:r>
+        <w:rPr>
+          <w:rFonts w:eastAsia="Arial" w:cs="Arial"/>
+          <w:color w:val="000000" w:themeColor="text1"/>
+          <w:szCs w:val="21"/>
+        </w:rPr>
+        <w:t xml:space="preserve">[28] Gerichtshof der Europäischen Union, Urteil vom 1. August 2025, verb. Rs. C-71/23 P und C-82/23 P, Frankreich und Kommission / CWS Powder Coatings u. a., ECLI:EU:C:2025:601.</w:t>
+      </w:r>
     </w:p>
     <w:sectPr>
       <w:headerReference w:type="default" r:id="rId8"/>

</xml_diff>